<commit_message>
Refining reports for farmers
</commit_message>
<xml_diff>
--- a/Scripts/Oyster_FarmReport_Dec25.docx
+++ b/Scripts/Oyster_FarmReport_Dec25.docx
@@ -1,38 +1,155 @@
 
 <file path=word/document.xml><?xml version="1.0" encoding="utf-8"?>
-<w:document xmlns:w="http://schemas.openxmlformats.org/wordprocessingml/2006/main" xmlns:m="http://schemas.openxmlformats.org/officeDocument/2006/math" xmlns:r="http://schemas.openxmlformats.org/officeDocument/2006/relationships" xmlns:o="urn:schemas-microsoft-com:office:office" xmlns:v="urn:schemas-microsoft-com:vml" xmlns:w10="urn:schemas-microsoft-com:office:word" xmlns:a="http://schemas.openxmlformats.org/drawingml/2006/main" xmlns:pic="http://schemas.openxmlformats.org/drawingml/2006/picture" xmlns:wp="http://schemas.openxmlformats.org/drawingml/2006/wordprocessingDrawing">
+<w:document xmlns:wpc="http://schemas.microsoft.com/office/word/2010/wordprocessingCanvas" xmlns:cx="http://schemas.microsoft.com/office/drawing/2014/chartex" xmlns:cx1="http://schemas.microsoft.com/office/drawing/2015/9/8/chartex" xmlns:cx2="http://schemas.microsoft.com/office/drawing/2015/10/21/chartex" xmlns:cx3="http://schemas.microsoft.com/office/drawing/2016/5/9/chartex" xmlns:cx4="http://schemas.microsoft.com/office/drawing/2016/5/10/chartex" xmlns:cx5="http://schemas.microsoft.com/office/drawing/2016/5/11/chartex" xmlns:cx6="http://schemas.microsoft.com/office/drawing/2016/5/12/chartex" xmlns:cx7="http://schemas.microsoft.com/office/drawing/2016/5/13/chartex" xmlns:cx8="http://schemas.microsoft.com/office/drawing/2016/5/14/chartex" xmlns:mc="http://schemas.openxmlformats.org/markup-compatibility/2006" xmlns:aink="http://schemas.microsoft.com/office/drawing/2016/ink" xmlns:am3d="http://schemas.microsoft.com/office/drawing/2017/model3d" xmlns:o="urn:schemas-microsoft-com:office:office" xmlns:oel="http://schemas.microsoft.com/office/2019/extlst" xmlns:r="http://schemas.openxmlformats.org/officeDocument/2006/relationships" xmlns:m="http://schemas.openxmlformats.org/officeDocument/2006/math" xmlns:v="urn:schemas-microsoft-com:vml" xmlns:wp14="http://schemas.microsoft.com/office/word/2010/wordprocessingDrawing" xmlns:wp="http://schemas.openxmlformats.org/drawingml/2006/wordprocessingDrawing" xmlns:w10="urn:schemas-microsoft-com:office:word" xmlns:w="http://schemas.openxmlformats.org/wordprocessingml/2006/main" xmlns:w14="http://schemas.microsoft.com/office/word/2010/wordml" xmlns:w15="http://schemas.microsoft.com/office/word/2012/wordml" xmlns:w16cex="http://schemas.microsoft.com/office/word/2018/wordml/cex" xmlns:w16cid="http://schemas.microsoft.com/office/word/2016/wordml/cid" xmlns:w16="http://schemas.microsoft.com/office/word/2018/wordml" xmlns:w16du="http://schemas.microsoft.com/office/word/2023/wordml/word16du" xmlns:w16sdtdh="http://schemas.microsoft.com/office/word/2020/wordml/sdtdatahash" xmlns:w16sdtfl="http://schemas.microsoft.com/office/word/2024/wordml/sdtformatlock" xmlns:w16se="http://schemas.microsoft.com/office/word/2015/wordml/symex" xmlns:wpg="http://schemas.microsoft.com/office/word/2010/wordprocessingGroup" xmlns:wpi="http://schemas.microsoft.com/office/word/2010/wordprocessingInk" xmlns:wne="http://schemas.microsoft.com/office/word/2006/wordml" xmlns:wps="http://schemas.microsoft.com/office/word/2010/wordprocessingShape" mc:Ignorable="w14 w15 w16se w16cid w16 w16cex w16sdtdh w16sdtfl w16du wp14">
   <w:body>
     <w:p>
       <w:pPr>
         <w:pStyle w:val="Title"/>
+        <w:jc w:val="left"/>
+        <w:rPr>
+          <w:b/>
+          <w:bCs/>
+          <w:sz w:val="28"/>
+          <w:szCs w:val="32"/>
+        </w:rPr>
       </w:pPr>
       <w:r>
-        <w:t xml:space="preserve">EVOS Oysters - Farm Report</w:t>
+        <w:rPr>
+          <w:b/>
+          <w:bCs/>
+          <w:sz w:val="28"/>
+          <w:szCs w:val="32"/>
+        </w:rPr>
+        <w:t>EVOS Oysters - Farm Report</w:t>
       </w:r>
     </w:p>
     <w:p>
       <w:pPr>
-        <w:pStyle w:val="Author"/>
+        <w:pStyle w:val="Title"/>
+        <w:jc w:val="left"/>
+        <w:rPr>
+          <w:b/>
+          <w:bCs/>
+          <w:sz w:val="28"/>
+          <w:szCs w:val="32"/>
+        </w:rPr>
       </w:pPr>
       <w:r>
-        <w:t xml:space="preserve">AOF1</w:t>
+        <w:rPr>
+          <w:b/>
+          <w:bCs/>
+          <w:sz w:val="28"/>
+          <w:szCs w:val="32"/>
+        </w:rPr>
+        <w:t>AOF1</w:t>
       </w:r>
     </w:p>
     <w:p>
       <w:pPr>
-        <w:pStyle w:val="Date"/>
+        <w:pStyle w:val="Title"/>
+        <w:jc w:val="left"/>
+        <w:rPr>
+          <w:b/>
+          <w:bCs/>
+          <w:sz w:val="28"/>
+          <w:szCs w:val="32"/>
+        </w:rPr>
       </w:pPr>
       <w:r>
-        <w:t xml:space="preserve">2025-11-14</w:t>
+        <w:rPr>
+          <w:b/>
+          <w:bCs/>
+          <w:sz w:val="28"/>
+          <w:szCs w:val="32"/>
+        </w:rPr>
+        <w:t>December 2025</w:t>
       </w:r>
     </w:p>
-    <w:bookmarkStart w:id="29" w:name="all-farms"/>
     <w:p>
       <w:pPr>
         <w:pStyle w:val="Heading1"/>
+        <w:rPr>
+          <w:sz w:val="28"/>
+          <w:szCs w:val="32"/>
+        </w:rPr>
       </w:pPr>
-      <w:r>
-        <w:t xml:space="preserve">All Farms</w:t>
+      <w:bookmarkStart w:id="0" w:name="by-farms"/>
+      <w:r>
+        <w:rPr>
+          <w:noProof/>
+          <w:sz w:val="28"/>
+          <w:szCs w:val="32"/>
+        </w:rPr>
+        <w:drawing>
+          <wp:anchor distT="0" distB="0" distL="114300" distR="114300" simplePos="0" relativeHeight="251662336" behindDoc="0" locked="0" layoutInCell="1" allowOverlap="1" wp14:anchorId="188591E1" wp14:editId="422C5C3C">
+            <wp:simplePos x="0" y="0"/>
+            <wp:positionH relativeFrom="column">
+              <wp:posOffset>0</wp:posOffset>
+            </wp:positionH>
+            <wp:positionV relativeFrom="paragraph">
+              <wp:posOffset>636270</wp:posOffset>
+            </wp:positionV>
+            <wp:extent cx="6115050" cy="4638675"/>
+            <wp:effectExtent l="0" t="0" r="0" b="0"/>
+            <wp:wrapTopAndBottom/>
+            <wp:docPr id="21" name="Picture"/>
+            <wp:cNvGraphicFramePr/>
+            <a:graphic xmlns:a="http://schemas.openxmlformats.org/drawingml/2006/main">
+              <a:graphicData uri="http://schemas.openxmlformats.org/drawingml/2006/picture">
+                <pic:pic xmlns:pic="http://schemas.openxmlformats.org/drawingml/2006/picture">
+                  <pic:nvPicPr>
+                    <pic:cNvPr id="22" name="Picture" descr="Oyster_FarmReport_Dec25_files/figure-docx/unnamed-chunk-4-1.png"/>
+                    <pic:cNvPicPr>
+                      <a:picLocks noChangeAspect="1" noChangeArrowheads="1"/>
+                    </pic:cNvPicPr>
+                  </pic:nvPicPr>
+                  <pic:blipFill>
+                    <a:blip r:embed="rId7">
+                      <a:extLst>
+                        <a:ext uri="{28A0092B-C50C-407E-A947-70E740481C1C}">
+                          <a14:useLocalDpi xmlns:a14="http://schemas.microsoft.com/office/drawing/2010/main" val="0"/>
+                        </a:ext>
+                      </a:extLst>
+                    </a:blip>
+                    <a:stretch>
+                      <a:fillRect/>
+                    </a:stretch>
+                  </pic:blipFill>
+                  <pic:spPr bwMode="auto">
+                    <a:xfrm>
+                      <a:off x="0" y="0"/>
+                      <a:ext cx="6115050" cy="4638675"/>
+                    </a:xfrm>
+                    <a:prstGeom prst="rect">
+                      <a:avLst/>
+                    </a:prstGeom>
+                    <a:noFill/>
+                    <a:ln w="9525">
+                      <a:noFill/>
+                      <a:headEnd/>
+                      <a:tailEnd/>
+                    </a:ln>
+                  </pic:spPr>
+                </pic:pic>
+              </a:graphicData>
+            </a:graphic>
+            <wp14:sizeRelH relativeFrom="page">
+              <wp14:pctWidth>0</wp14:pctWidth>
+            </wp14:sizeRelH>
+            <wp14:sizeRelV relativeFrom="page">
+              <wp14:pctHeight>0</wp14:pctHeight>
+            </wp14:sizeRelV>
+          </wp:anchor>
+        </w:drawing>
+      </w:r>
+      <w:r>
+        <w:rPr>
+          <w:b/>
+          <w:bCs/>
+          <w:sz w:val="28"/>
+          <w:szCs w:val="32"/>
+        </w:rPr>
+        <w:t>By Farm</w:t>
       </w:r>
     </w:p>
     <w:p>
@@ -40,22 +157,258 @@
         <w:pStyle w:val="FirstParagraph"/>
       </w:pPr>
       <w:r>
+        <w:rPr>
+          <w:noProof/>
+        </w:rPr>
+        <w:lastRenderedPageBreak/>
         <w:drawing>
-          <wp:inline>
-            <wp:extent cx="5334000" cy="4267200"/>
-            <wp:effectExtent b="0" l="0" r="0" t="0"/>
-            <wp:docPr descr="" title="" id="21" name="Picture"/>
-            <a:graphic>
+          <wp:anchor distT="0" distB="0" distL="114300" distR="114300" simplePos="0" relativeHeight="251672576" behindDoc="0" locked="0" layoutInCell="1" allowOverlap="1" wp14:anchorId="1DCCFDDC" wp14:editId="2651691A">
+            <wp:simplePos x="0" y="0"/>
+            <wp:positionH relativeFrom="column">
+              <wp:posOffset>-142875</wp:posOffset>
+            </wp:positionH>
+            <wp:positionV relativeFrom="paragraph">
+              <wp:posOffset>4514850</wp:posOffset>
+            </wp:positionV>
+            <wp:extent cx="5705475" cy="4200525"/>
+            <wp:effectExtent l="0" t="0" r="0" b="0"/>
+            <wp:wrapTopAndBottom/>
+            <wp:docPr id="27" name="Picture"/>
+            <wp:cNvGraphicFramePr/>
+            <a:graphic xmlns:a="http://schemas.openxmlformats.org/drawingml/2006/main">
               <a:graphicData uri="http://schemas.openxmlformats.org/drawingml/2006/picture">
-                <pic:pic>
+                <pic:pic xmlns:pic="http://schemas.openxmlformats.org/drawingml/2006/picture">
                   <pic:nvPicPr>
-                    <pic:cNvPr descr="Oyster_FarmReport_Dec25_files/figure-docx/unnamed-chunk-4-1.png" id="22" name="Picture"/>
+                    <pic:cNvPr id="28" name="Picture" descr="Oyster_FarmReport_Dec25_files/figure-docx/unnamed-chunk-4-3.png"/>
                     <pic:cNvPicPr>
-                      <a:picLocks noChangeArrowheads="1" noChangeAspect="1"/>
+                      <a:picLocks noChangeAspect="1" noChangeArrowheads="1"/>
                     </pic:cNvPicPr>
                   </pic:nvPicPr>
                   <pic:blipFill>
-                    <a:blip r:embed="rId20"/>
+                    <a:blip r:embed="rId8">
+                      <a:extLst>
+                        <a:ext uri="{28A0092B-C50C-407E-A947-70E740481C1C}">
+                          <a14:useLocalDpi xmlns:a14="http://schemas.microsoft.com/office/drawing/2010/main" val="0"/>
+                        </a:ext>
+                      </a:extLst>
+                    </a:blip>
+                    <a:stretch>
+                      <a:fillRect/>
+                    </a:stretch>
+                  </pic:blipFill>
+                  <pic:spPr bwMode="auto">
+                    <a:xfrm>
+                      <a:off x="0" y="0"/>
+                      <a:ext cx="5705475" cy="4200525"/>
+                    </a:xfrm>
+                    <a:prstGeom prst="rect">
+                      <a:avLst/>
+                    </a:prstGeom>
+                    <a:noFill/>
+                    <a:ln w="9525">
+                      <a:noFill/>
+                      <a:headEnd/>
+                      <a:tailEnd/>
+                    </a:ln>
+                  </pic:spPr>
+                </pic:pic>
+              </a:graphicData>
+            </a:graphic>
+            <wp14:sizeRelH relativeFrom="page">
+              <wp14:pctWidth>0</wp14:pctWidth>
+            </wp14:sizeRelH>
+            <wp14:sizeRelV relativeFrom="page">
+              <wp14:pctHeight>0</wp14:pctHeight>
+            </wp14:sizeRelV>
+          </wp:anchor>
+        </w:drawing>
+      </w:r>
+      <w:r>
+        <w:rPr>
+          <w:noProof/>
+        </w:rPr>
+        <w:drawing>
+          <wp:inline distT="0" distB="0" distL="0" distR="0" wp14:anchorId="6F3D93EB" wp14:editId="4383C2DE">
+            <wp:extent cx="5505450" cy="4400550"/>
+            <wp:effectExtent l="0" t="0" r="0" b="0"/>
+            <wp:docPr id="24" name="Picture"/>
+            <wp:cNvGraphicFramePr/>
+            <a:graphic xmlns:a="http://schemas.openxmlformats.org/drawingml/2006/main">
+              <a:graphicData uri="http://schemas.openxmlformats.org/drawingml/2006/picture">
+                <pic:pic xmlns:pic="http://schemas.openxmlformats.org/drawingml/2006/picture">
+                  <pic:nvPicPr>
+                    <pic:cNvPr id="25" name="Picture" descr="Oyster_FarmReport_Dec25_files/figure-docx/unnamed-chunk-4-2.png"/>
+                    <pic:cNvPicPr>
+                      <a:picLocks noChangeAspect="1" noChangeArrowheads="1"/>
+                    </pic:cNvPicPr>
+                  </pic:nvPicPr>
+                  <pic:blipFill>
+                    <a:blip r:embed="rId9"/>
+                    <a:stretch>
+                      <a:fillRect/>
+                    </a:stretch>
+                  </pic:blipFill>
+                  <pic:spPr bwMode="auto">
+                    <a:xfrm>
+                      <a:off x="0" y="0"/>
+                      <a:ext cx="5505450" cy="4400550"/>
+                    </a:xfrm>
+                    <a:prstGeom prst="rect">
+                      <a:avLst/>
+                    </a:prstGeom>
+                    <a:noFill/>
+                    <a:ln w="9525">
+                      <a:noFill/>
+                      <a:headEnd/>
+                      <a:tailEnd/>
+                    </a:ln>
+                  </pic:spPr>
+                </pic:pic>
+              </a:graphicData>
+            </a:graphic>
+          </wp:inline>
+        </w:drawing>
+      </w:r>
+      <w:r>
+        <w:t xml:space="preserve"> </w:t>
+      </w:r>
+    </w:p>
+    <w:p>
+      <w:pPr>
+        <w:pStyle w:val="FirstParagraph"/>
+        <w:rPr>
+          <w:b/>
+          <w:bCs/>
+        </w:rPr>
+      </w:pPr>
+      <w:r>
+        <w:rPr>
+          <w:b/>
+          <w:bCs/>
+        </w:rPr>
+        <w:lastRenderedPageBreak/>
+        <w:t>By farm summary</w:t>
+      </w:r>
+    </w:p>
+    <w:p>
+      <w:pPr>
+        <w:pStyle w:val="FirstParagraph"/>
+      </w:pPr>
+      <w:r>
+        <w:t>Most farms experienced shell heigh</w:t>
+      </w:r>
+      <w:r>
+        <w:t>t</w:t>
+      </w:r>
+      <w:r>
+        <w:t xml:space="preserve"> growth</w:t>
+      </w:r>
+      <w:r>
+        <w:t xml:space="preserve"> from summer 2025 to fall 2025</w:t>
+      </w:r>
+      <w:r>
+        <w:t xml:space="preserve">. All farms saw </w:t>
+      </w:r>
+      <w:proofErr w:type="gramStart"/>
+      <w:r>
+        <w:t>sharp</w:t>
+      </w:r>
+      <w:r>
+        <w:t xml:space="preserve"> </w:t>
+      </w:r>
+      <w:r>
+        <w:t>meat</w:t>
+      </w:r>
+      <w:proofErr w:type="gramEnd"/>
+      <w:r>
+        <w:t xml:space="preserve"> </w:t>
+      </w:r>
+      <w:r>
+        <w:t>weight</w:t>
+      </w:r>
+      <w:r>
+        <w:t xml:space="preserve"> increases from summer 2025 to fall 2025</w:t>
+      </w:r>
+      <w:r>
+        <w:t xml:space="preserve">. </w:t>
+      </w:r>
+      <w:r>
+        <w:t>Cup ratios</w:t>
+      </w:r>
+      <w:r>
+        <w:t xml:space="preserve"> are calculated by dividing shell depth by shell height. A</w:t>
+      </w:r>
+      <w:r>
+        <w:t xml:space="preserve"> </w:t>
+      </w:r>
+      <w:r>
+        <w:t>higher value is a thicker oyster relative to height</w:t>
+      </w:r>
+      <w:r>
+        <w:t xml:space="preserve">. </w:t>
+      </w:r>
+      <w:r>
+        <w:t>Although there are no universally accepted thresholds for shell shapes, generally accepted shell quality thresholds</w:t>
+      </w:r>
+      <w:r>
+        <w:t xml:space="preserve"> are</w:t>
+      </w:r>
+      <w:r>
+        <w:t xml:space="preserve"> greater than 0.25 for cup ratios (Brake et al., 2003; Mizuta and </w:t>
+      </w:r>
+      <w:proofErr w:type="spellStart"/>
+      <w:r>
+        <w:t>Wikfors</w:t>
+      </w:r>
+      <w:proofErr w:type="spellEnd"/>
+      <w:r>
+        <w:t>, 2019).</w:t>
+      </w:r>
+      <w:r>
+        <w:t xml:space="preserve"> Average cup ratios ranged from 0.28 to 0.35 at the fall 2025 sampling event.</w:t>
+      </w:r>
+    </w:p>
+    <w:p>
+      <w:pPr>
+        <w:pStyle w:val="Heading1"/>
+        <w:rPr>
+          <w:sz w:val="28"/>
+          <w:szCs w:val="28"/>
+        </w:rPr>
+      </w:pPr>
+      <w:bookmarkStart w:id="1" w:name="by-region"/>
+      <w:bookmarkEnd w:id="0"/>
+      <w:r>
+        <w:rPr>
+          <w:b/>
+          <w:bCs/>
+          <w:sz w:val="28"/>
+          <w:szCs w:val="28"/>
+        </w:rPr>
+        <w:lastRenderedPageBreak/>
+        <w:t>By Region</w:t>
+      </w:r>
+      <w:r>
+        <w:rPr>
+          <w:noProof/>
+        </w:rPr>
+        <w:drawing>
+          <wp:inline distT="0" distB="0" distL="0" distR="0" wp14:anchorId="36C51F17" wp14:editId="43468108">
+            <wp:extent cx="5334000" cy="4267200"/>
+            <wp:effectExtent l="0" t="0" r="0" b="0"/>
+            <wp:docPr id="31" name="Picture"/>
+            <wp:cNvGraphicFramePr/>
+            <a:graphic xmlns:a="http://schemas.openxmlformats.org/drawingml/2006/main">
+              <a:graphicData uri="http://schemas.openxmlformats.org/drawingml/2006/picture">
+                <pic:pic xmlns:pic="http://schemas.openxmlformats.org/drawingml/2006/picture">
+                  <pic:nvPicPr>
+                    <pic:cNvPr id="32" name="Picture" descr="Oyster_FarmReport_Dec25_files/figure-docx/unnamed-chunk-5-1.png"/>
+                    <pic:cNvPicPr>
+                      <a:picLocks noChangeAspect="1" noChangeArrowheads="1"/>
+                    </pic:cNvPicPr>
+                  </pic:nvPicPr>
+                  <pic:blipFill>
+                    <a:blip r:embed="rId10"/>
                     <a:stretch>
                       <a:fillRect/>
                     </a:stretch>
@@ -81,23 +434,33 @@
           </wp:inline>
         </w:drawing>
       </w:r>
-      <w:r>
+    </w:p>
+    <w:p>
+      <w:pPr>
+        <w:pStyle w:val="FirstParagraph"/>
+      </w:pPr>
+      <w:r>
+        <w:rPr>
+          <w:noProof/>
+        </w:rPr>
+        <w:lastRenderedPageBreak/>
         <w:drawing>
-          <wp:inline>
+          <wp:inline distT="0" distB="0" distL="0" distR="0" wp14:anchorId="28CC2B88" wp14:editId="3BAEB90D">
             <wp:extent cx="5334000" cy="4267200"/>
-            <wp:effectExtent b="0" l="0" r="0" t="0"/>
-            <wp:docPr descr="" title="" id="24" name="Picture"/>
-            <a:graphic>
+            <wp:effectExtent l="0" t="0" r="0" b="0"/>
+            <wp:docPr id="34" name="Picture"/>
+            <wp:cNvGraphicFramePr/>
+            <a:graphic xmlns:a="http://schemas.openxmlformats.org/drawingml/2006/main">
               <a:graphicData uri="http://schemas.openxmlformats.org/drawingml/2006/picture">
-                <pic:pic>
+                <pic:pic xmlns:pic="http://schemas.openxmlformats.org/drawingml/2006/picture">
                   <pic:nvPicPr>
-                    <pic:cNvPr descr="Oyster_FarmReport_Dec25_files/figure-docx/unnamed-chunk-4-2.png" id="25" name="Picture"/>
+                    <pic:cNvPr id="35" name="Picture" descr="Oyster_FarmReport_Dec25_files/figure-docx/unnamed-chunk-5-2.png"/>
                     <pic:cNvPicPr>
-                      <a:picLocks noChangeArrowheads="1" noChangeAspect="1"/>
+                      <a:picLocks noChangeAspect="1" noChangeArrowheads="1"/>
                     </pic:cNvPicPr>
                   </pic:nvPicPr>
                   <pic:blipFill>
-                    <a:blip r:embed="rId23"/>
+                    <a:blip r:embed="rId11"/>
                     <a:stretch>
                       <a:fillRect/>
                     </a:stretch>
@@ -124,22 +487,27 @@
         </w:drawing>
       </w:r>
       <w:r>
+        <w:rPr>
+          <w:noProof/>
+        </w:rPr>
+        <w:lastRenderedPageBreak/>
         <w:drawing>
-          <wp:inline>
+          <wp:inline distT="0" distB="0" distL="0" distR="0" wp14:anchorId="38FE0DDA" wp14:editId="05662DC7">
             <wp:extent cx="5334000" cy="4267200"/>
-            <wp:effectExtent b="0" l="0" r="0" t="0"/>
-            <wp:docPr descr="" title="" id="27" name="Picture"/>
-            <a:graphic>
+            <wp:effectExtent l="0" t="0" r="0" b="0"/>
+            <wp:docPr id="37" name="Picture"/>
+            <wp:cNvGraphicFramePr/>
+            <a:graphic xmlns:a="http://schemas.openxmlformats.org/drawingml/2006/main">
               <a:graphicData uri="http://schemas.openxmlformats.org/drawingml/2006/picture">
-                <pic:pic>
+                <pic:pic xmlns:pic="http://schemas.openxmlformats.org/drawingml/2006/picture">
                   <pic:nvPicPr>
-                    <pic:cNvPr descr="Oyster_FarmReport_Dec25_files/figure-docx/unnamed-chunk-4-3.png" id="28" name="Picture"/>
+                    <pic:cNvPr id="38" name="Picture" descr="Oyster_FarmReport_Dec25_files/figure-docx/unnamed-chunk-5-3.png"/>
                     <pic:cNvPicPr>
-                      <a:picLocks noChangeArrowheads="1" noChangeAspect="1"/>
+                      <a:picLocks noChangeAspect="1" noChangeArrowheads="1"/>
                     </pic:cNvPicPr>
                   </pic:nvPicPr>
                   <pic:blipFill>
-                    <a:blip r:embed="rId26"/>
+                    <a:blip r:embed="rId12"/>
                     <a:stretch>
                       <a:fillRect/>
                     </a:stretch>
@@ -166,14 +534,85 @@
         </w:drawing>
       </w:r>
     </w:p>
-    <w:bookmarkEnd w:id="29"/>
-    <w:bookmarkStart w:id="39" w:name="aof1"/>
     <w:p>
       <w:pPr>
         <w:pStyle w:val="Heading1"/>
       </w:pPr>
-      <w:r>
-        <w:t xml:space="preserve">AOF1</w:t>
+      <w:bookmarkStart w:id="2" w:name="aof1"/>
+      <w:bookmarkEnd w:id="1"/>
+      <w:r>
+        <w:rPr>
+          <w:noProof/>
+        </w:rPr>
+        <w:lastRenderedPageBreak/>
+        <w:drawing>
+          <wp:anchor distT="0" distB="0" distL="114300" distR="114300" simplePos="0" relativeHeight="251675648" behindDoc="0" locked="0" layoutInCell="1" allowOverlap="1" wp14:anchorId="420AA4AD" wp14:editId="297F6928">
+            <wp:simplePos x="0" y="0"/>
+            <wp:positionH relativeFrom="column">
+              <wp:posOffset>-47625</wp:posOffset>
+            </wp:positionH>
+            <wp:positionV relativeFrom="paragraph">
+              <wp:posOffset>419100</wp:posOffset>
+            </wp:positionV>
+            <wp:extent cx="5334000" cy="4267200"/>
+            <wp:effectExtent l="0" t="0" r="0" b="0"/>
+            <wp:wrapTopAndBottom/>
+            <wp:docPr id="41" name="Picture" descr="A graph with different colored squares&#10;&#10;AI-generated content may be incorrect."/>
+            <wp:cNvGraphicFramePr/>
+            <a:graphic xmlns:a="http://schemas.openxmlformats.org/drawingml/2006/main">
+              <a:graphicData uri="http://schemas.openxmlformats.org/drawingml/2006/picture">
+                <pic:pic xmlns:pic="http://schemas.openxmlformats.org/drawingml/2006/picture">
+                  <pic:nvPicPr>
+                    <pic:cNvPr id="41" name="Picture" descr="A graph with different colored squares&#10;&#10;AI-generated content may be incorrect."/>
+                    <pic:cNvPicPr>
+                      <a:picLocks noChangeAspect="1" noChangeArrowheads="1"/>
+                    </pic:cNvPicPr>
+                  </pic:nvPicPr>
+                  <pic:blipFill>
+                    <a:blip r:embed="rId13">
+                      <a:extLst>
+                        <a:ext uri="{28A0092B-C50C-407E-A947-70E740481C1C}">
+                          <a14:useLocalDpi xmlns:a14="http://schemas.microsoft.com/office/drawing/2010/main" val="0"/>
+                        </a:ext>
+                      </a:extLst>
+                    </a:blip>
+                    <a:stretch>
+                      <a:fillRect/>
+                    </a:stretch>
+                  </pic:blipFill>
+                  <pic:spPr bwMode="auto">
+                    <a:xfrm>
+                      <a:off x="0" y="0"/>
+                      <a:ext cx="5334000" cy="4267200"/>
+                    </a:xfrm>
+                    <a:prstGeom prst="rect">
+                      <a:avLst/>
+                    </a:prstGeom>
+                    <a:noFill/>
+                    <a:ln w="9525">
+                      <a:noFill/>
+                      <a:headEnd/>
+                      <a:tailEnd/>
+                    </a:ln>
+                  </pic:spPr>
+                </pic:pic>
+              </a:graphicData>
+            </a:graphic>
+            <wp14:sizeRelH relativeFrom="page">
+              <wp14:pctWidth>0</wp14:pctWidth>
+            </wp14:sizeRelH>
+            <wp14:sizeRelV relativeFrom="page">
+              <wp14:pctHeight>0</wp14:pctHeight>
+            </wp14:sizeRelV>
+          </wp:anchor>
+        </w:drawing>
+      </w:r>
+      <w:r>
+        <w:rPr>
+          <w:b/>
+          <w:bCs/>
+        </w:rPr>
+        <w:t>AOF1</w:t>
       </w:r>
     </w:p>
     <w:p>
@@ -181,22 +620,27 @@
         <w:pStyle w:val="FirstParagraph"/>
       </w:pPr>
       <w:r>
+        <w:rPr>
+          <w:noProof/>
+        </w:rPr>
+        <w:lastRenderedPageBreak/>
         <w:drawing>
-          <wp:inline>
+          <wp:inline distT="0" distB="0" distL="0" distR="0" wp14:anchorId="135E7DC7" wp14:editId="2B0C03FA">
             <wp:extent cx="5334000" cy="4267200"/>
-            <wp:effectExtent b="0" l="0" r="0" t="0"/>
-            <wp:docPr descr="" title="" id="31" name="Picture"/>
-            <a:graphic>
+            <wp:effectExtent l="0" t="0" r="0" b="0"/>
+            <wp:docPr id="44" name="Picture"/>
+            <wp:cNvGraphicFramePr/>
+            <a:graphic xmlns:a="http://schemas.openxmlformats.org/drawingml/2006/main">
               <a:graphicData uri="http://schemas.openxmlformats.org/drawingml/2006/picture">
-                <pic:pic>
+                <pic:pic xmlns:pic="http://schemas.openxmlformats.org/drawingml/2006/picture">
                   <pic:nvPicPr>
-                    <pic:cNvPr descr="Oyster_FarmReport_Dec25_files/figure-docx/unnamed-chunk-5-1.png" id="32" name="Picture"/>
+                    <pic:cNvPr id="45" name="Picture" descr="Oyster_FarmReport_Dec25_files/figure-docx/unnamed-chunk-6-2.png"/>
                     <pic:cNvPicPr>
-                      <a:picLocks noChangeArrowheads="1" noChangeAspect="1"/>
+                      <a:picLocks noChangeAspect="1" noChangeArrowheads="1"/>
                     </pic:cNvPicPr>
                   </pic:nvPicPr>
                   <pic:blipFill>
-                    <a:blip r:embed="rId30"/>
+                    <a:blip r:embed="rId14"/>
                     <a:stretch>
                       <a:fillRect/>
                     </a:stretch>
@@ -223,22 +667,27 @@
         </w:drawing>
       </w:r>
       <w:r>
+        <w:rPr>
+          <w:noProof/>
+        </w:rPr>
+        <w:lastRenderedPageBreak/>
         <w:drawing>
-          <wp:inline>
+          <wp:inline distT="0" distB="0" distL="0" distR="0" wp14:anchorId="070148A5" wp14:editId="574C859B">
             <wp:extent cx="5334000" cy="4267200"/>
-            <wp:effectExtent b="0" l="0" r="0" t="0"/>
-            <wp:docPr descr="" title="" id="34" name="Picture"/>
-            <a:graphic>
+            <wp:effectExtent l="0" t="0" r="0" b="0"/>
+            <wp:docPr id="47" name="Picture"/>
+            <wp:cNvGraphicFramePr/>
+            <a:graphic xmlns:a="http://schemas.openxmlformats.org/drawingml/2006/main">
               <a:graphicData uri="http://schemas.openxmlformats.org/drawingml/2006/picture">
-                <pic:pic>
+                <pic:pic xmlns:pic="http://schemas.openxmlformats.org/drawingml/2006/picture">
                   <pic:nvPicPr>
-                    <pic:cNvPr descr="Oyster_FarmReport_Dec25_files/figure-docx/unnamed-chunk-5-2.png" id="35" name="Picture"/>
+                    <pic:cNvPr id="48" name="Picture" descr="Oyster_FarmReport_Dec25_files/figure-docx/unnamed-chunk-6-3.png"/>
                     <pic:cNvPicPr>
-                      <a:picLocks noChangeArrowheads="1" noChangeAspect="1"/>
+                      <a:picLocks noChangeAspect="1" noChangeArrowheads="1"/>
                     </pic:cNvPicPr>
                   </pic:nvPicPr>
                   <pic:blipFill>
-                    <a:blip r:embed="rId33"/>
+                    <a:blip r:embed="rId15"/>
                     <a:stretch>
                       <a:fillRect/>
                     </a:stretch>
@@ -264,72 +713,115 @@
           </wp:inline>
         </w:drawing>
       </w:r>
-      <w:r>
-        <w:drawing>
-          <wp:inline>
-            <wp:extent cx="5334000" cy="4267200"/>
-            <wp:effectExtent b="0" l="0" r="0" t="0"/>
-            <wp:docPr descr="" title="" id="37" name="Picture"/>
-            <a:graphic>
-              <a:graphicData uri="http://schemas.openxmlformats.org/drawingml/2006/picture">
-                <pic:pic>
-                  <pic:nvPicPr>
-                    <pic:cNvPr descr="Oyster_FarmReport_Dec25_files/figure-docx/unnamed-chunk-5-3.png" id="38" name="Picture"/>
-                    <pic:cNvPicPr>
-                      <a:picLocks noChangeArrowheads="1" noChangeAspect="1"/>
-                    </pic:cNvPicPr>
-                  </pic:nvPicPr>
-                  <pic:blipFill>
-                    <a:blip r:embed="rId36"/>
-                    <a:stretch>
-                      <a:fillRect/>
-                    </a:stretch>
-                  </pic:blipFill>
-                  <pic:spPr bwMode="auto">
-                    <a:xfrm>
-                      <a:off x="0" y="0"/>
-                      <a:ext cx="5334000" cy="4267200"/>
-                    </a:xfrm>
-                    <a:prstGeom prst="rect">
-                      <a:avLst/>
-                    </a:prstGeom>
-                    <a:noFill/>
-                    <a:ln w="9525">
-                      <a:noFill/>
-                      <a:headEnd/>
-                      <a:tailEnd/>
-                    </a:ln>
-                  </pic:spPr>
-                </pic:pic>
-              </a:graphicData>
-            </a:graphic>
-          </wp:inline>
-        </w:drawing>
-      </w:r>
+      <w:bookmarkEnd w:id="2"/>
     </w:p>
-    <w:bookmarkEnd w:id="39"/>
-    <w:sectPr/>
+    <w:sectPr>
+      <w:footerReference w:type="default" r:id="rId16"/>
+      <w:pgSz w:w="12240" w:h="15840"/>
+      <w:pgMar w:top="1440" w:right="1440" w:bottom="1440" w:left="1440" w:header="720" w:footer="720" w:gutter="0"/>
+      <w:cols w:space="720"/>
+    </w:sectPr>
   </w:body>
 </w:document>
 </file>
 
-<file path=word/comments.xml><?xml version="1.0" encoding="utf-8"?>
-<w:comments xmlns:w="http://schemas.openxmlformats.org/wordprocessingml/2006/main" xmlns:m="http://schemas.openxmlformats.org/officeDocument/2006/math" xmlns:r="http://schemas.openxmlformats.org/officeDocument/2006/relationships" xmlns:o="urn:schemas-microsoft-com:office:office" xmlns:v="urn:schemas-microsoft-com:vml" xmlns:w10="urn:schemas-microsoft-com:office:word" xmlns:a="http://schemas.openxmlformats.org/drawingml/2006/main" xmlns:pic="http://schemas.openxmlformats.org/drawingml/2006/picture" xmlns:wp="http://schemas.openxmlformats.org/drawingml/2006/wordprocessingDrawing"/>
+<file path=word/endnotes.xml><?xml version="1.0" encoding="utf-8"?>
+<w:endnotes xmlns:wpc="http://schemas.microsoft.com/office/word/2010/wordprocessingCanvas" xmlns:cx="http://schemas.microsoft.com/office/drawing/2014/chartex" xmlns:cx1="http://schemas.microsoft.com/office/drawing/2015/9/8/chartex" xmlns:cx2="http://schemas.microsoft.com/office/drawing/2015/10/21/chartex" xmlns:cx3="http://schemas.microsoft.com/office/drawing/2016/5/9/chartex" xmlns:cx4="http://schemas.microsoft.com/office/drawing/2016/5/10/chartex" xmlns:cx5="http://schemas.microsoft.com/office/drawing/2016/5/11/chartex" xmlns:cx6="http://schemas.microsoft.com/office/drawing/2016/5/12/chartex" xmlns:cx7="http://schemas.microsoft.com/office/drawing/2016/5/13/chartex" xmlns:cx8="http://schemas.microsoft.com/office/drawing/2016/5/14/chartex" xmlns:mc="http://schemas.openxmlformats.org/markup-compatibility/2006" xmlns:aink="http://schemas.microsoft.com/office/drawing/2016/ink" xmlns:am3d="http://schemas.microsoft.com/office/drawing/2017/model3d" xmlns:o="urn:schemas-microsoft-com:office:office" xmlns:oel="http://schemas.microsoft.com/office/2019/extlst" xmlns:r="http://schemas.openxmlformats.org/officeDocument/2006/relationships" xmlns:m="http://schemas.openxmlformats.org/officeDocument/2006/math" xmlns:v="urn:schemas-microsoft-com:vml" xmlns:wp14="http://schemas.microsoft.com/office/word/2010/wordprocessingDrawing" xmlns:wp="http://schemas.openxmlformats.org/drawingml/2006/wordprocessingDrawing" xmlns:w10="urn:schemas-microsoft-com:office:word" xmlns:w="http://schemas.openxmlformats.org/wordprocessingml/2006/main" xmlns:w14="http://schemas.microsoft.com/office/word/2010/wordml" xmlns:w15="http://schemas.microsoft.com/office/word/2012/wordml" xmlns:w16cex="http://schemas.microsoft.com/office/word/2018/wordml/cex" xmlns:w16cid="http://schemas.microsoft.com/office/word/2016/wordml/cid" xmlns:w16="http://schemas.microsoft.com/office/word/2018/wordml" xmlns:w16du="http://schemas.microsoft.com/office/word/2023/wordml/word16du" xmlns:w16sdtdh="http://schemas.microsoft.com/office/word/2020/wordml/sdtdatahash" xmlns:w16sdtfl="http://schemas.microsoft.com/office/word/2024/wordml/sdtformatlock" xmlns:w16se="http://schemas.microsoft.com/office/word/2015/wordml/symex" xmlns:wpg="http://schemas.microsoft.com/office/word/2010/wordprocessingGroup" xmlns:wpi="http://schemas.microsoft.com/office/word/2010/wordprocessingInk" xmlns:wne="http://schemas.microsoft.com/office/word/2006/wordml" xmlns:wps="http://schemas.microsoft.com/office/word/2010/wordprocessingShape" mc:Ignorable="w14 w15 w16se w16cid w16 w16cex w16sdtdh w16sdtfl w16du wp14">
+  <w:endnote w:type="separator" w:id="-1">
+    <w:p>
+      <w:pPr>
+        <w:spacing w:after="0"/>
+      </w:pPr>
+      <w:r>
+        <w:separator/>
+      </w:r>
+    </w:p>
+  </w:endnote>
+  <w:endnote w:type="continuationSeparator" w:id="0">
+    <w:p>
+      <w:pPr>
+        <w:spacing w:after="0"/>
+      </w:pPr>
+      <w:r>
+        <w:continuationSeparator/>
+      </w:r>
+    </w:p>
+  </w:endnote>
+</w:endnotes>
+</file>
+
+<file path=word/footer1.xml><?xml version="1.0" encoding="utf-8"?>
+<w:ftr xmlns:wpc="http://schemas.microsoft.com/office/word/2010/wordprocessingCanvas" xmlns:cx="http://schemas.microsoft.com/office/drawing/2014/chartex" xmlns:cx1="http://schemas.microsoft.com/office/drawing/2015/9/8/chartex" xmlns:cx2="http://schemas.microsoft.com/office/drawing/2015/10/21/chartex" xmlns:cx3="http://schemas.microsoft.com/office/drawing/2016/5/9/chartex" xmlns:cx4="http://schemas.microsoft.com/office/drawing/2016/5/10/chartex" xmlns:cx5="http://schemas.microsoft.com/office/drawing/2016/5/11/chartex" xmlns:cx6="http://schemas.microsoft.com/office/drawing/2016/5/12/chartex" xmlns:cx7="http://schemas.microsoft.com/office/drawing/2016/5/13/chartex" xmlns:cx8="http://schemas.microsoft.com/office/drawing/2016/5/14/chartex" xmlns:mc="http://schemas.openxmlformats.org/markup-compatibility/2006" xmlns:aink="http://schemas.microsoft.com/office/drawing/2016/ink" xmlns:am3d="http://schemas.microsoft.com/office/drawing/2017/model3d" xmlns:o="urn:schemas-microsoft-com:office:office" xmlns:oel="http://schemas.microsoft.com/office/2019/extlst" xmlns:r="http://schemas.openxmlformats.org/officeDocument/2006/relationships" xmlns:m="http://schemas.openxmlformats.org/officeDocument/2006/math" xmlns:v="urn:schemas-microsoft-com:vml" xmlns:wp14="http://schemas.microsoft.com/office/word/2010/wordprocessingDrawing" xmlns:wp="http://schemas.openxmlformats.org/drawingml/2006/wordprocessingDrawing" xmlns:w10="urn:schemas-microsoft-com:office:word" xmlns:w="http://schemas.openxmlformats.org/wordprocessingml/2006/main" xmlns:w14="http://schemas.microsoft.com/office/word/2010/wordml" xmlns:w15="http://schemas.microsoft.com/office/word/2012/wordml" xmlns:w16cex="http://schemas.microsoft.com/office/word/2018/wordml/cex" xmlns:w16cid="http://schemas.microsoft.com/office/word/2016/wordml/cid" xmlns:w16="http://schemas.microsoft.com/office/word/2018/wordml" xmlns:w16du="http://schemas.microsoft.com/office/word/2023/wordml/word16du" xmlns:w16sdtdh="http://schemas.microsoft.com/office/word/2020/wordml/sdtdatahash" xmlns:w16sdtfl="http://schemas.microsoft.com/office/word/2024/wordml/sdtformatlock" xmlns:w16se="http://schemas.microsoft.com/office/word/2015/wordml/symex" xmlns:wpg="http://schemas.microsoft.com/office/word/2010/wordprocessingGroup" xmlns:wpi="http://schemas.microsoft.com/office/word/2010/wordprocessingInk" xmlns:wne="http://schemas.microsoft.com/office/word/2006/wordml" xmlns:wps="http://schemas.microsoft.com/office/word/2010/wordprocessingShape" mc:Ignorable="w14 w15 w16se w16cid w16 w16cex w16sdtdh w16sdtfl w16du wp14">
+  <w:sdt>
+    <w:sdtPr>
+      <w:id w:val="-566962509"/>
+      <w:docPartObj>
+        <w:docPartGallery w:val="Page Numbers (Bottom of Page)"/>
+        <w:docPartUnique/>
+      </w:docPartObj>
+    </w:sdtPr>
+    <w:sdtEndPr>
+      <w:rPr>
+        <w:noProof/>
+      </w:rPr>
+    </w:sdtEndPr>
+    <w:sdtContent>
+      <w:p>
+        <w:pPr>
+          <w:pStyle w:val="Footer"/>
+          <w:jc w:val="right"/>
+        </w:pPr>
+        <w:r>
+          <w:fldChar w:fldCharType="begin"/>
+        </w:r>
+        <w:r>
+          <w:instrText xml:space="preserve"> PAGE   \* MERGEFORMAT </w:instrText>
+        </w:r>
+        <w:r>
+          <w:fldChar w:fldCharType="separate"/>
+        </w:r>
+        <w:r>
+          <w:rPr>
+            <w:noProof/>
+          </w:rPr>
+          <w:t>2</w:t>
+        </w:r>
+        <w:r>
+          <w:rPr>
+            <w:noProof/>
+          </w:rPr>
+          <w:fldChar w:fldCharType="end"/>
+        </w:r>
+      </w:p>
+    </w:sdtContent>
+  </w:sdt>
+  <w:p>
+    <w:pPr>
+      <w:pStyle w:val="Footer"/>
+    </w:pPr>
+  </w:p>
+</w:ftr>
 </file>
 
 <file path=word/footnotes.xml><?xml version="1.0" encoding="utf-8"?>
-<w:footnotes xmlns:w="http://schemas.openxmlformats.org/wordprocessingml/2006/main" xmlns:m="http://schemas.openxmlformats.org/officeDocument/2006/math" xmlns:r="http://schemas.openxmlformats.org/officeDocument/2006/relationships" xmlns:o="urn:schemas-microsoft-com:office:office" xmlns:v="urn:schemas-microsoft-com:vml" xmlns:w10="urn:schemas-microsoft-com:office:word" xmlns:a="http://schemas.openxmlformats.org/drawingml/2006/main" xmlns:pic="http://schemas.openxmlformats.org/drawingml/2006/picture" xmlns:wp="http://schemas.openxmlformats.org/drawingml/2006/wordprocessingDrawing">
+<w:footnotes xmlns:wpc="http://schemas.microsoft.com/office/word/2010/wordprocessingCanvas" xmlns:cx="http://schemas.microsoft.com/office/drawing/2014/chartex" xmlns:cx1="http://schemas.microsoft.com/office/drawing/2015/9/8/chartex" xmlns:cx2="http://schemas.microsoft.com/office/drawing/2015/10/21/chartex" xmlns:cx3="http://schemas.microsoft.com/office/drawing/2016/5/9/chartex" xmlns:cx4="http://schemas.microsoft.com/office/drawing/2016/5/10/chartex" xmlns:cx5="http://schemas.microsoft.com/office/drawing/2016/5/11/chartex" xmlns:cx6="http://schemas.microsoft.com/office/drawing/2016/5/12/chartex" xmlns:cx7="http://schemas.microsoft.com/office/drawing/2016/5/13/chartex" xmlns:cx8="http://schemas.microsoft.com/office/drawing/2016/5/14/chartex" xmlns:mc="http://schemas.openxmlformats.org/markup-compatibility/2006" xmlns:aink="http://schemas.microsoft.com/office/drawing/2016/ink" xmlns:am3d="http://schemas.microsoft.com/office/drawing/2017/model3d" xmlns:o="urn:schemas-microsoft-com:office:office" xmlns:oel="http://schemas.microsoft.com/office/2019/extlst" xmlns:r="http://schemas.openxmlformats.org/officeDocument/2006/relationships" xmlns:m="http://schemas.openxmlformats.org/officeDocument/2006/math" xmlns:v="urn:schemas-microsoft-com:vml" xmlns:wp14="http://schemas.microsoft.com/office/word/2010/wordprocessingDrawing" xmlns:wp="http://schemas.openxmlformats.org/drawingml/2006/wordprocessingDrawing" xmlns:w10="urn:schemas-microsoft-com:office:word" xmlns:w="http://schemas.openxmlformats.org/wordprocessingml/2006/main" xmlns:w14="http://schemas.microsoft.com/office/word/2010/wordml" xmlns:w15="http://schemas.microsoft.com/office/word/2012/wordml" xmlns:w16cex="http://schemas.microsoft.com/office/word/2018/wordml/cex" xmlns:w16cid="http://schemas.microsoft.com/office/word/2016/wordml/cid" xmlns:w16="http://schemas.microsoft.com/office/word/2018/wordml" xmlns:w16du="http://schemas.microsoft.com/office/word/2023/wordml/word16du" xmlns:w16sdtdh="http://schemas.microsoft.com/office/word/2020/wordml/sdtdatahash" xmlns:w16sdtfl="http://schemas.microsoft.com/office/word/2024/wordml/sdtformatlock" xmlns:w16se="http://schemas.microsoft.com/office/word/2015/wordml/symex" xmlns:wpg="http://schemas.microsoft.com/office/word/2010/wordprocessingGroup" xmlns:wpi="http://schemas.microsoft.com/office/word/2010/wordprocessingInk" xmlns:wne="http://schemas.microsoft.com/office/word/2006/wordml" xmlns:wps="http://schemas.microsoft.com/office/word/2010/wordprocessingShape" mc:Ignorable="w14 w15 w16se w16cid w16 w16cex w16sdtdh w16sdtfl w16du wp14">
+  <w:footnote w:type="separator" w:id="-1">
+    <w:p>
+      <w:pPr>
+        <w:spacing w:after="0"/>
+      </w:pPr>
+      <w:r>
+        <w:separator/>
+      </w:r>
+    </w:p>
+  </w:footnote>
   <w:footnote w:type="continuationSeparator" w:id="0">
     <w:p>
+      <w:pPr>
+        <w:spacing w:after="0"/>
+      </w:pPr>
       <w:r>
         <w:continuationSeparator/>
-      </w:r>
-    </w:p>
-  </w:footnote>
-  <w:footnote w:type="separator" w:id="-1">
-    <w:p>
-      <w:r>
-        <w:separator/>
       </w:r>
     </w:p>
   </w:footnote>
@@ -337,10 +829,11 @@
 </file>
 
 <file path=word/numbering.xml><?xml version="1.0" encoding="utf-8"?>
-<w:numbering xmlns:w="http://schemas.openxmlformats.org/wordprocessingml/2006/main">
-  <w:abstractNum w:abstractNumId="990">
+<w:numbering xmlns:wpc="http://schemas.microsoft.com/office/word/2010/wordprocessingCanvas" xmlns:cx="http://schemas.microsoft.com/office/drawing/2014/chartex" xmlns:cx1="http://schemas.microsoft.com/office/drawing/2015/9/8/chartex" xmlns:cx2="http://schemas.microsoft.com/office/drawing/2015/10/21/chartex" xmlns:cx3="http://schemas.microsoft.com/office/drawing/2016/5/9/chartex" xmlns:cx4="http://schemas.microsoft.com/office/drawing/2016/5/10/chartex" xmlns:cx5="http://schemas.microsoft.com/office/drawing/2016/5/11/chartex" xmlns:cx6="http://schemas.microsoft.com/office/drawing/2016/5/12/chartex" xmlns:cx7="http://schemas.microsoft.com/office/drawing/2016/5/13/chartex" xmlns:cx8="http://schemas.microsoft.com/office/drawing/2016/5/14/chartex" xmlns:mc="http://schemas.openxmlformats.org/markup-compatibility/2006" xmlns:aink="http://schemas.microsoft.com/office/drawing/2016/ink" xmlns:am3d="http://schemas.microsoft.com/office/drawing/2017/model3d" xmlns:o="urn:schemas-microsoft-com:office:office" xmlns:oel="http://schemas.microsoft.com/office/2019/extlst" xmlns:r="http://schemas.openxmlformats.org/officeDocument/2006/relationships" xmlns:m="http://schemas.openxmlformats.org/officeDocument/2006/math" xmlns:v="urn:schemas-microsoft-com:vml" xmlns:wp14="http://schemas.microsoft.com/office/word/2010/wordprocessingDrawing" xmlns:wp="http://schemas.openxmlformats.org/drawingml/2006/wordprocessingDrawing" xmlns:w10="urn:schemas-microsoft-com:office:word" xmlns:w="http://schemas.openxmlformats.org/wordprocessingml/2006/main" xmlns:w14="http://schemas.microsoft.com/office/word/2010/wordml" xmlns:w15="http://schemas.microsoft.com/office/word/2012/wordml" xmlns:w16cex="http://schemas.microsoft.com/office/word/2018/wordml/cex" xmlns:w16cid="http://schemas.microsoft.com/office/word/2016/wordml/cid" xmlns:w16="http://schemas.microsoft.com/office/word/2018/wordml" xmlns:w16du="http://schemas.microsoft.com/office/word/2023/wordml/word16du" xmlns:w16sdtdh="http://schemas.microsoft.com/office/word/2020/wordml/sdtdatahash" xmlns:w16sdtfl="http://schemas.microsoft.com/office/word/2024/wordml/sdtformatlock" xmlns:w16se="http://schemas.microsoft.com/office/word/2015/wordml/symex" xmlns:wpg="http://schemas.microsoft.com/office/word/2010/wordprocessingGroup" xmlns:wpi="http://schemas.microsoft.com/office/word/2010/wordprocessingInk" xmlns:wne="http://schemas.microsoft.com/office/word/2006/wordml" xmlns:wps="http://schemas.microsoft.com/office/word/2010/wordprocessingShape" mc:Ignorable="w14 w15 w16se w16cid w16 w16cex w16sdtdh w16sdtfl w16du wp14">
+  <w:abstractNum w:abstractNumId="0" w15:restartNumberingAfterBreak="0">
     <w:nsid w:val="0000A990"/>
     <w:multiLevelType w:val="multilevel"/>
+    <w:tmpl w:val="7E4A6ED4"/>
     <w:lvl w:ilvl="0">
       <w:numFmt w:val="bullet"/>
       <w:lvlText w:val=" "/>
@@ -414,21 +907,21 @@
       </w:pPr>
     </w:lvl>
   </w:abstractNum>
-  <w:num w:numId="1000">
-    <w:abstractNumId w:val="990"/>
+  <w:num w:numId="1" w16cid:durableId="806509745">
+    <w:abstractNumId w:val="0"/>
   </w:num>
 </w:numbering>
 </file>
 
 <file path=word/styles.xml><?xml version="1.0" encoding="utf-8"?>
-<w:styles xmlns:r="http://schemas.openxmlformats.org/officeDocument/2006/relationships" xmlns:w="http://schemas.openxmlformats.org/wordprocessingml/2006/main">
+<w:styles xmlns:mc="http://schemas.openxmlformats.org/markup-compatibility/2006" xmlns:r="http://schemas.openxmlformats.org/officeDocument/2006/relationships" xmlns:w="http://schemas.openxmlformats.org/wordprocessingml/2006/main" xmlns:w14="http://schemas.microsoft.com/office/word/2010/wordml" xmlns:w15="http://schemas.microsoft.com/office/word/2012/wordml" xmlns:w16cex="http://schemas.microsoft.com/office/word/2018/wordml/cex" xmlns:w16cid="http://schemas.microsoft.com/office/word/2016/wordml/cid" xmlns:w16="http://schemas.microsoft.com/office/word/2018/wordml" xmlns:w16du="http://schemas.microsoft.com/office/word/2023/wordml/word16du" xmlns:w16sdtdh="http://schemas.microsoft.com/office/word/2020/wordml/sdtdatahash" xmlns:w16sdtfl="http://schemas.microsoft.com/office/word/2024/wordml/sdtformatlock" xmlns:w16se="http://schemas.microsoft.com/office/word/2015/wordml/symex" mc:Ignorable="w14 w15 w16se w16cid w16 w16cex w16sdtdh w16sdtfl w16du">
   <w:docDefaults>
     <w:rPrDefault>
       <w:rPr>
-        <w:rFonts w:asciiTheme="minorHAnsi" w:cstheme="minorBidi" w:eastAsiaTheme="minorHAnsi" w:hAnsiTheme="minorHAnsi"/>
+        <w:rFonts w:asciiTheme="minorHAnsi" w:eastAsiaTheme="minorHAnsi" w:hAnsiTheme="minorHAnsi" w:cstheme="minorBidi"/>
         <w:sz w:val="24"/>
         <w:szCs w:val="24"/>
-        <w:lang w:bidi="ar-SA" w:eastAsia="en-US" w:val="en-US"/>
+        <w:lang w:val="en-US" w:eastAsia="en-US" w:bidi="ar-SA"/>
       </w:rPr>
     </w:rPrDefault>
     <w:pPrDefault>
@@ -437,164 +930,256 @@
       </w:pPr>
     </w:pPrDefault>
   </w:docDefaults>
-  <w:latentStyles w:count="276" w:defLockedState="0" w:defQFormat="0" w:defSemiHidden="0" w:defUIPriority="0" w:defUnhideWhenUsed="0"/>
-  <w:style w:default="1" w:styleId="Normal" w:type="paragraph">
+  <w:latentStyles w:defLockedState="0" w:defUIPriority="0" w:defSemiHidden="0" w:defUnhideWhenUsed="0" w:defQFormat="0" w:count="376">
+    <w:lsdException w:name="footer" w:uiPriority="99"/>
+    <w:lsdException w:name="Normal Table" w:semiHidden="1" w:unhideWhenUsed="1"/>
+    <w:lsdException w:name="Table Simple 1" w:semiHidden="1" w:unhideWhenUsed="1"/>
+    <w:lsdException w:name="Table Simple 2" w:semiHidden="1" w:unhideWhenUsed="1"/>
+    <w:lsdException w:name="Table Simple 3" w:semiHidden="1" w:unhideWhenUsed="1"/>
+    <w:lsdException w:name="Table Classic 1" w:semiHidden="1" w:unhideWhenUsed="1"/>
+    <w:lsdException w:name="Table Classic 2" w:semiHidden="1" w:unhideWhenUsed="1"/>
+    <w:lsdException w:name="Table Classic 3" w:semiHidden="1" w:unhideWhenUsed="1"/>
+    <w:lsdException w:name="Table Classic 4" w:semiHidden="1" w:unhideWhenUsed="1"/>
+    <w:lsdException w:name="Table Colorful 1" w:semiHidden="1" w:unhideWhenUsed="1"/>
+    <w:lsdException w:name="Table Colorful 2" w:semiHidden="1" w:unhideWhenUsed="1"/>
+    <w:lsdException w:name="Table Colorful 3" w:semiHidden="1" w:unhideWhenUsed="1"/>
+    <w:lsdException w:name="Table Columns 1" w:semiHidden="1" w:unhideWhenUsed="1"/>
+    <w:lsdException w:name="Table Columns 2" w:semiHidden="1" w:unhideWhenUsed="1"/>
+    <w:lsdException w:name="Table Columns 3" w:semiHidden="1" w:unhideWhenUsed="1"/>
+    <w:lsdException w:name="Table Columns 4" w:semiHidden="1" w:unhideWhenUsed="1"/>
+    <w:lsdException w:name="Table Columns 5" w:semiHidden="1" w:unhideWhenUsed="1"/>
+    <w:lsdException w:name="Table Grid 1" w:semiHidden="1" w:unhideWhenUsed="1"/>
+    <w:lsdException w:name="Table Grid 2" w:semiHidden="1" w:unhideWhenUsed="1"/>
+    <w:lsdException w:name="Table Grid 3" w:semiHidden="1" w:unhideWhenUsed="1"/>
+    <w:lsdException w:name="Table Grid 4" w:semiHidden="1" w:unhideWhenUsed="1"/>
+    <w:lsdException w:name="Table Grid 5" w:semiHidden="1" w:unhideWhenUsed="1"/>
+    <w:lsdException w:name="Table Grid 6" w:semiHidden="1" w:unhideWhenUsed="1"/>
+    <w:lsdException w:name="Table Grid 7" w:semiHidden="1" w:unhideWhenUsed="1"/>
+    <w:lsdException w:name="Table Grid 8" w:semiHidden="1" w:unhideWhenUsed="1"/>
+    <w:lsdException w:name="Table List 1" w:semiHidden="1" w:unhideWhenUsed="1"/>
+    <w:lsdException w:name="Table List 2" w:semiHidden="1" w:unhideWhenUsed="1"/>
+    <w:lsdException w:name="Table List 3" w:semiHidden="1" w:unhideWhenUsed="1"/>
+    <w:lsdException w:name="Table List 4" w:semiHidden="1" w:unhideWhenUsed="1"/>
+    <w:lsdException w:name="Table List 5" w:semiHidden="1" w:unhideWhenUsed="1"/>
+    <w:lsdException w:name="Table List 6" w:semiHidden="1" w:unhideWhenUsed="1"/>
+    <w:lsdException w:name="Table List 7" w:semiHidden="1" w:unhideWhenUsed="1"/>
+    <w:lsdException w:name="Table List 8" w:semiHidden="1" w:unhideWhenUsed="1"/>
+    <w:lsdException w:name="Table 3D effects 1" w:semiHidden="1" w:unhideWhenUsed="1"/>
+    <w:lsdException w:name="Table 3D effects 2" w:semiHidden="1" w:unhideWhenUsed="1"/>
+    <w:lsdException w:name="Table 3D effects 3" w:semiHidden="1" w:unhideWhenUsed="1"/>
+    <w:lsdException w:name="Table Contemporary" w:semiHidden="1" w:unhideWhenUsed="1"/>
+    <w:lsdException w:name="Table Elegant" w:semiHidden="1" w:unhideWhenUsed="1"/>
+    <w:lsdException w:name="Table Professional" w:semiHidden="1" w:unhideWhenUsed="1"/>
+    <w:lsdException w:name="Table Subtle 1" w:semiHidden="1" w:unhideWhenUsed="1"/>
+    <w:lsdException w:name="Table Subtle 2" w:semiHidden="1" w:unhideWhenUsed="1"/>
+    <w:lsdException w:name="Table Web 1" w:semiHidden="1" w:unhideWhenUsed="1"/>
+    <w:lsdException w:name="Table Web 2" w:semiHidden="1" w:unhideWhenUsed="1"/>
+    <w:lsdException w:name="Table Web 3" w:semiHidden="1" w:unhideWhenUsed="1"/>
+    <w:lsdException w:name="Table Theme" w:semiHidden="1" w:unhideWhenUsed="1"/>
+    <w:lsdException w:name="Light Shading"/>
+    <w:lsdException w:name="Light List"/>
+    <w:lsdException w:name="Light Grid"/>
+    <w:lsdException w:name="Medium Shading 1"/>
+    <w:lsdException w:name="Medium Shading 2"/>
+    <w:lsdException w:name="Medium List 1"/>
+    <w:lsdException w:name="Medium List 2"/>
+    <w:lsdException w:name="Medium Grid 1"/>
+    <w:lsdException w:name="Medium Grid 2"/>
+    <w:lsdException w:name="Medium Grid 3"/>
+    <w:lsdException w:name="Dark List"/>
+    <w:lsdException w:name="Colorful Shading"/>
+    <w:lsdException w:name="Colorful List"/>
+    <w:lsdException w:name="Colorful Grid"/>
+    <w:lsdException w:name="Light Shading Accent 1"/>
+    <w:lsdException w:name="Light List Accent 1"/>
+    <w:lsdException w:name="Light Grid Accent 1"/>
+    <w:lsdException w:name="Medium Shading 1 Accent 1"/>
+    <w:lsdException w:name="Medium Shading 2 Accent 1"/>
+    <w:lsdException w:name="Medium List 1 Accent 1"/>
+    <w:lsdException w:name="Medium List 2 Accent 1"/>
+    <w:lsdException w:name="Medium Grid 1 Accent 1"/>
+    <w:lsdException w:name="Medium Grid 2 Accent 1"/>
+    <w:lsdException w:name="Medium Grid 3 Accent 1"/>
+    <w:lsdException w:name="Dark List Accent 1"/>
+    <w:lsdException w:name="Colorful Shading Accent 1"/>
+    <w:lsdException w:name="Colorful List Accent 1"/>
+    <w:lsdException w:name="Colorful Grid Accent 1"/>
+    <w:lsdException w:name="Light Shading Accent 2"/>
+    <w:lsdException w:name="Light List Accent 2"/>
+    <w:lsdException w:name="Light Grid Accent 2"/>
+    <w:lsdException w:name="Medium Shading 1 Accent 2"/>
+    <w:lsdException w:name="Medium Shading 2 Accent 2"/>
+    <w:lsdException w:name="Medium List 1 Accent 2"/>
+    <w:lsdException w:name="Medium List 2 Accent 2"/>
+    <w:lsdException w:name="Medium Grid 1 Accent 2"/>
+    <w:lsdException w:name="Medium Grid 2 Accent 2"/>
+    <w:lsdException w:name="Medium Grid 3 Accent 2"/>
+    <w:lsdException w:name="Dark List Accent 2"/>
+    <w:lsdException w:name="Colorful Shading Accent 2"/>
+    <w:lsdException w:name="Colorful List Accent 2"/>
+    <w:lsdException w:name="Colorful Grid Accent 2"/>
+    <w:lsdException w:name="Light Shading Accent 3"/>
+    <w:lsdException w:name="Light List Accent 3"/>
+    <w:lsdException w:name="Light Grid Accent 3"/>
+    <w:lsdException w:name="Medium Shading 1 Accent 3"/>
+    <w:lsdException w:name="Medium Shading 2 Accent 3"/>
+    <w:lsdException w:name="Medium List 1 Accent 3"/>
+    <w:lsdException w:name="Medium List 2 Accent 3"/>
+    <w:lsdException w:name="Medium Grid 1 Accent 3"/>
+    <w:lsdException w:name="Medium Grid 2 Accent 3"/>
+    <w:lsdException w:name="Medium Grid 3 Accent 3"/>
+    <w:lsdException w:name="Dark List Accent 3"/>
+    <w:lsdException w:name="Colorful Shading Accent 3"/>
+    <w:lsdException w:name="Colorful List Accent 3"/>
+    <w:lsdException w:name="Colorful Grid Accent 3"/>
+    <w:lsdException w:name="Light Shading Accent 4"/>
+    <w:lsdException w:name="Light List Accent 4"/>
+    <w:lsdException w:name="Light Grid Accent 4"/>
+    <w:lsdException w:name="Medium Shading 1 Accent 4"/>
+    <w:lsdException w:name="Medium Shading 2 Accent 4"/>
+    <w:lsdException w:name="Medium List 1 Accent 4"/>
+    <w:lsdException w:name="Medium List 2 Accent 4"/>
+    <w:lsdException w:name="Medium Grid 1 Accent 4"/>
+    <w:lsdException w:name="Medium Grid 2 Accent 4"/>
+    <w:lsdException w:name="Medium Grid 3 Accent 4"/>
+    <w:lsdException w:name="Dark List Accent 4"/>
+    <w:lsdException w:name="Colorful Shading Accent 4"/>
+    <w:lsdException w:name="Colorful List Accent 4"/>
+    <w:lsdException w:name="Colorful Grid Accent 4"/>
+    <w:lsdException w:name="Light Shading Accent 5"/>
+    <w:lsdException w:name="Light List Accent 5"/>
+    <w:lsdException w:name="Light Grid Accent 5"/>
+    <w:lsdException w:name="Medium Shading 1 Accent 5"/>
+    <w:lsdException w:name="Medium Shading 2 Accent 5"/>
+    <w:lsdException w:name="Medium List 1 Accent 5"/>
+    <w:lsdException w:name="Medium List 2 Accent 5"/>
+    <w:lsdException w:name="Medium Grid 1 Accent 5"/>
+    <w:lsdException w:name="Medium Grid 2 Accent 5"/>
+    <w:lsdException w:name="Medium Grid 3 Accent 5"/>
+    <w:lsdException w:name="Dark List Accent 5"/>
+    <w:lsdException w:name="Colorful Shading Accent 5"/>
+    <w:lsdException w:name="Colorful List Accent 5"/>
+    <w:lsdException w:name="Colorful Grid Accent 5"/>
+    <w:lsdException w:name="Light Shading Accent 6"/>
+    <w:lsdException w:name="Light List Accent 6"/>
+    <w:lsdException w:name="Light Grid Accent 6"/>
+    <w:lsdException w:name="Medium Shading 1 Accent 6"/>
+    <w:lsdException w:name="Medium Shading 2 Accent 6"/>
+    <w:lsdException w:name="Medium List 1 Accent 6"/>
+    <w:lsdException w:name="Medium List 2 Accent 6"/>
+    <w:lsdException w:name="Medium Grid 1 Accent 6"/>
+    <w:lsdException w:name="Medium Grid 2 Accent 6"/>
+    <w:lsdException w:name="Medium Grid 3 Accent 6"/>
+    <w:lsdException w:name="Dark List Accent 6"/>
+    <w:lsdException w:name="Colorful Shading Accent 6"/>
+    <w:lsdException w:name="Colorful List Accent 6"/>
+    <w:lsdException w:name="Colorful Grid Accent 6"/>
+    <w:lsdException w:name="Grid Table 4" w:uiPriority="49"/>
+    <w:lsdException w:name="Grid Table 5 Dark" w:uiPriority="50"/>
+    <w:lsdException w:name="Grid Table 6 Colorful" w:uiPriority="51"/>
+    <w:lsdException w:name="Grid Table 7 Colorful" w:uiPriority="52"/>
+    <w:lsdException w:name="Grid Table 1 Light Accent 1" w:uiPriority="46"/>
+    <w:lsdException w:name="Grid Table 2 Accent 1" w:uiPriority="47"/>
+    <w:lsdException w:name="Grid Table 3 Accent 1" w:uiPriority="48"/>
+    <w:lsdException w:name="Grid Table 4 Accent 1" w:uiPriority="49"/>
+    <w:lsdException w:name="Grid Table 5 Dark Accent 1" w:uiPriority="50"/>
+    <w:lsdException w:name="Grid Table 6 Colorful Accent 1" w:uiPriority="51"/>
+    <w:lsdException w:name="Grid Table 7 Colorful Accent 1" w:uiPriority="52"/>
+    <w:lsdException w:name="Grid Table 1 Light Accent 2" w:uiPriority="46"/>
+    <w:lsdException w:name="Grid Table 2 Accent 2" w:uiPriority="47"/>
+    <w:lsdException w:name="Grid Table 3 Accent 2" w:uiPriority="48"/>
+    <w:lsdException w:name="Grid Table 4 Accent 2" w:uiPriority="49"/>
+    <w:lsdException w:name="Grid Table 5 Dark Accent 2" w:uiPriority="50"/>
+    <w:lsdException w:name="Grid Table 6 Colorful Accent 2" w:uiPriority="51"/>
+    <w:lsdException w:name="Grid Table 7 Colorful Accent 2" w:uiPriority="52"/>
+    <w:lsdException w:name="Grid Table 1 Light Accent 3" w:uiPriority="46"/>
+    <w:lsdException w:name="Grid Table 2 Accent 3" w:uiPriority="47"/>
+    <w:lsdException w:name="Grid Table 3 Accent 3" w:uiPriority="48"/>
+    <w:lsdException w:name="Grid Table 4 Accent 3" w:uiPriority="49"/>
+    <w:lsdException w:name="Grid Table 5 Dark Accent 3" w:uiPriority="50"/>
+    <w:lsdException w:name="Grid Table 6 Colorful Accent 3" w:uiPriority="51"/>
+    <w:lsdException w:name="Grid Table 7 Colorful Accent 3" w:uiPriority="52"/>
+    <w:lsdException w:name="Grid Table 1 Light Accent 4" w:uiPriority="46"/>
+    <w:lsdException w:name="Grid Table 2 Accent 4" w:uiPriority="47"/>
+    <w:lsdException w:name="Grid Table 3 Accent 4" w:uiPriority="48"/>
+    <w:lsdException w:name="Grid Table 4 Accent 4" w:uiPriority="49"/>
+    <w:lsdException w:name="Grid Table 5 Dark Accent 4" w:uiPriority="50"/>
+    <w:lsdException w:name="Grid Table 6 Colorful Accent 4" w:uiPriority="51"/>
+    <w:lsdException w:name="Grid Table 7 Colorful Accent 4" w:uiPriority="52"/>
+    <w:lsdException w:name="Grid Table 1 Light Accent 5" w:uiPriority="46"/>
+    <w:lsdException w:name="Grid Table 2 Accent 5" w:uiPriority="47"/>
+    <w:lsdException w:name="Grid Table 3 Accent 5" w:uiPriority="48"/>
+    <w:lsdException w:name="Grid Table 4 Accent 5" w:uiPriority="49"/>
+    <w:lsdException w:name="Grid Table 5 Dark Accent 5" w:uiPriority="50"/>
+    <w:lsdException w:name="Grid Table 6 Colorful Accent 5" w:uiPriority="51"/>
+    <w:lsdException w:name="Grid Table 7 Colorful Accent 5" w:uiPriority="52"/>
+    <w:lsdException w:name="Grid Table 1 Light Accent 6" w:uiPriority="46"/>
+    <w:lsdException w:name="Grid Table 2 Accent 6" w:uiPriority="47"/>
+    <w:lsdException w:name="Grid Table 3 Accent 6" w:uiPriority="48"/>
+    <w:lsdException w:name="Grid Table 4 Accent 6" w:uiPriority="49"/>
+    <w:lsdException w:name="Grid Table 5 Dark Accent 6" w:uiPriority="50"/>
+    <w:lsdException w:name="Grid Table 6 Colorful Accent 6" w:uiPriority="51"/>
+    <w:lsdException w:name="Grid Table 7 Colorful Accent 6" w:uiPriority="52"/>
+    <w:lsdException w:name="List Table 1 Light" w:uiPriority="46"/>
+    <w:lsdException w:name="List Table 2" w:uiPriority="47"/>
+    <w:lsdException w:name="List Table 3" w:uiPriority="48"/>
+    <w:lsdException w:name="List Table 4" w:uiPriority="49"/>
+    <w:lsdException w:name="List Table 5 Dark" w:uiPriority="50"/>
+    <w:lsdException w:name="List Table 6 Colorful" w:uiPriority="51"/>
+    <w:lsdException w:name="List Table 7 Colorful" w:uiPriority="52"/>
+    <w:lsdException w:name="List Table 1 Light Accent 1" w:uiPriority="46"/>
+    <w:lsdException w:name="List Table 2 Accent 1" w:uiPriority="47"/>
+    <w:lsdException w:name="List Table 3 Accent 1" w:uiPriority="48"/>
+    <w:lsdException w:name="List Table 4 Accent 1" w:uiPriority="49"/>
+    <w:lsdException w:name="List Table 5 Dark Accent 1" w:uiPriority="50"/>
+    <w:lsdException w:name="List Table 6 Colorful Accent 1" w:uiPriority="51"/>
+    <w:lsdException w:name="List Table 7 Colorful Accent 1" w:uiPriority="52"/>
+    <w:lsdException w:name="List Table 1 Light Accent 2" w:uiPriority="46"/>
+    <w:lsdException w:name="List Table 2 Accent 2" w:uiPriority="47"/>
+    <w:lsdException w:name="List Table 3 Accent 2" w:uiPriority="48"/>
+    <w:lsdException w:name="List Table 4 Accent 2" w:uiPriority="49"/>
+    <w:lsdException w:name="List Table 5 Dark Accent 2" w:uiPriority="50"/>
+    <w:lsdException w:name="List Table 6 Colorful Accent 2" w:uiPriority="51"/>
+    <w:lsdException w:name="List Table 7 Colorful Accent 2" w:uiPriority="52"/>
+    <w:lsdException w:name="List Table 1 Light Accent 3" w:uiPriority="46"/>
+    <w:lsdException w:name="List Table 2 Accent 3" w:uiPriority="47"/>
+    <w:lsdException w:name="List Table 3 Accent 3" w:uiPriority="48"/>
+    <w:lsdException w:name="List Table 4 Accent 3" w:uiPriority="49"/>
+    <w:lsdException w:name="List Table 5 Dark Accent 3" w:uiPriority="50"/>
+    <w:lsdException w:name="List Table 6 Colorful Accent 3" w:uiPriority="51"/>
+    <w:lsdException w:name="List Table 7 Colorful Accent 3" w:uiPriority="52"/>
+    <w:lsdException w:name="List Table 1 Light Accent 4" w:uiPriority="46"/>
+    <w:lsdException w:name="List Table 2 Accent 4" w:uiPriority="47"/>
+    <w:lsdException w:name="List Table 3 Accent 4" w:uiPriority="48"/>
+    <w:lsdException w:name="List Table 4 Accent 4" w:uiPriority="49"/>
+    <w:lsdException w:name="List Table 5 Dark Accent 4" w:uiPriority="50"/>
+    <w:lsdException w:name="List Table 6 Colorful Accent 4" w:uiPriority="51"/>
+    <w:lsdException w:name="List Table 7 Colorful Accent 4" w:uiPriority="52"/>
+    <w:lsdException w:name="List Table 1 Light Accent 5" w:uiPriority="46"/>
+    <w:lsdException w:name="List Table 2 Accent 5" w:uiPriority="47"/>
+    <w:lsdException w:name="List Table 3 Accent 5" w:uiPriority="48"/>
+    <w:lsdException w:name="List Table 4 Accent 5" w:uiPriority="49"/>
+    <w:lsdException w:name="List Table 5 Dark Accent 5" w:uiPriority="50"/>
+    <w:lsdException w:name="List Table 6 Colorful Accent 5" w:uiPriority="51"/>
+    <w:lsdException w:name="List Table 7 Colorful Accent 5" w:uiPriority="52"/>
+    <w:lsdException w:name="List Table 1 Light Accent 6" w:uiPriority="46"/>
+    <w:lsdException w:name="List Table 2 Accent 6" w:uiPriority="47"/>
+    <w:lsdException w:name="List Table 3 Accent 6" w:uiPriority="48"/>
+    <w:lsdException w:name="List Table 4 Accent 6" w:uiPriority="49"/>
+    <w:lsdException w:name="List Table 5 Dark Accent 6" w:uiPriority="50"/>
+    <w:lsdException w:name="List Table 6 Colorful Accent 6" w:uiPriority="51"/>
+    <w:lsdException w:name="List Table 7 Colorful Accent 6" w:uiPriority="52"/>
+    <w:lsdException w:name="Mention" w:semiHidden="1" w:uiPriority="99" w:unhideWhenUsed="1"/>
+    <w:lsdException w:name="Smart Hyperlink" w:semiHidden="1" w:uiPriority="99" w:unhideWhenUsed="1"/>
+    <w:lsdException w:name="Hashtag" w:semiHidden="1" w:uiPriority="99" w:unhideWhenUsed="1"/>
+    <w:lsdException w:name="Unresolved Mention" w:semiHidden="1" w:uiPriority="99" w:unhideWhenUsed="1"/>
+    <w:lsdException w:name="Smart Link" w:semiHidden="1" w:uiPriority="99" w:unhideWhenUsed="1"/>
+  </w:latentStyles>
+  <w:style w:type="paragraph" w:default="1" w:styleId="Normal">
     <w:name w:val="Normal"/>
     <w:qFormat/>
   </w:style>
-  <w:style w:styleId="BodyText" w:type="paragraph">
-    <w:name w:val="Body Text"/>
-    <w:basedOn w:val="Normal"/>
-    <w:link w:val="BodyTextChar"/>
-    <w:qFormat/>
-    <w:pPr>
-      <w:spacing w:after="180" w:before="180"/>
-    </w:pPr>
-  </w:style>
-  <w:style w:customStyle="1" w:styleId="FirstParagraph" w:type="paragraph">
-    <w:name w:val="First Paragraph"/>
-    <w:basedOn w:val="BodyText"/>
-    <w:next w:val="BodyText"/>
-    <w:qFormat/>
-  </w:style>
-  <w:style w:customStyle="1" w:styleId="Compact" w:type="paragraph">
-    <w:name w:val="Compact"/>
-    <w:basedOn w:val="BodyText"/>
-    <w:qFormat/>
-    <w:pPr>
-      <w:spacing w:after="36" w:before="36"/>
-    </w:pPr>
-  </w:style>
-  <w:style w:styleId="Title" w:type="paragraph">
-    <w:name w:val="Title"/>
-    <w:basedOn w:val="Normal"/>
-    <w:next w:val="BodyText"/>
-    <w:link w:val="TitleChar"/>
-    <w:uiPriority w:val="10"/>
-    <w:qFormat/>
-    <w:rsid w:val="00A10FD9"/>
-    <w:pPr>
-      <w:spacing w:after="80" w:line="240" w:lineRule="auto"/>
-      <w:contextualSpacing/>
-      <w:jc w:val="center"/>
-    </w:pPr>
-    <w:rPr>
-      <w:rFonts w:asciiTheme="majorHAnsi" w:cstheme="majorBidi" w:eastAsiaTheme="majorEastAsia" w:hAnsiTheme="majorHAnsi"/>
-      <w:spacing w:val="-10"/>
-      <w:kern w:val="28"/>
-      <w:sz w:val="56"/>
-      <w:szCs w:val="56"/>
-    </w:rPr>
-  </w:style>
-  <w:style w:customStyle="1" w:styleId="TitleChar" w:type="character">
-    <w:name w:val="Title Char"/>
-    <w:basedOn w:val="DefaultParagraphFont"/>
-    <w:link w:val="Title"/>
-    <w:uiPriority w:val="10"/>
-    <w:rsid w:val="00A10FD9"/>
-    <w:rPr>
-      <w:rFonts w:asciiTheme="majorHAnsi" w:cstheme="majorBidi" w:eastAsiaTheme="majorEastAsia" w:hAnsiTheme="majorHAnsi"/>
-      <w:spacing w:val="-10"/>
-      <w:kern w:val="28"/>
-      <w:sz w:val="56"/>
-      <w:szCs w:val="56"/>
-    </w:rPr>
-  </w:style>
-  <w:style w:styleId="Subtitle" w:type="paragraph">
-    <w:name w:val="Subtitle"/>
-    <w:basedOn w:val="Title"/>
-    <w:next w:val="BodyText"/>
-    <w:link w:val="SubtitleChar"/>
-    <w:uiPriority w:val="11"/>
-    <w:qFormat/>
-    <w:rsid w:val="00A10FD9"/>
-    <w:pPr>
-      <w:numPr>
-        <w:ilvl w:val="1"/>
-      </w:numPr>
-    </w:pPr>
-    <w:rPr>
-      <w:rFonts w:cstheme="majorBidi" w:eastAsiaTheme="majorEastAsia"/>
-      <w:spacing w:val="15"/>
-      <w:sz w:val="28"/>
-      <w:szCs w:val="28"/>
-    </w:rPr>
-  </w:style>
-  <w:style w:customStyle="1" w:styleId="SubtitleChar" w:type="character">
-    <w:name w:val="Subtitle Char"/>
-    <w:basedOn w:val="DefaultParagraphFont"/>
-    <w:link w:val="Subtitle"/>
-    <w:uiPriority w:val="11"/>
-    <w:rsid w:val="00A10FD9"/>
-    <w:rPr>
-      <w:rFonts w:cstheme="majorBidi" w:eastAsiaTheme="majorEastAsia"/>
-      <w:color w:themeColor="text1" w:themeTint="A6" w:val="595959"/>
-      <w:spacing w:val="15"/>
-      <w:sz w:val="28"/>
-      <w:szCs w:val="28"/>
-    </w:rPr>
-  </w:style>
-  <w:style w:customStyle="1" w:styleId="Author" w:type="paragraph">
-    <w:name w:val="Author"/>
-    <w:next w:val="BodyText"/>
-    <w:qFormat/>
-    <w:pPr>
-      <w:keepNext/>
-      <w:keepLines/>
-      <w:jc w:val="center"/>
-    </w:pPr>
-  </w:style>
-  <w:style w:styleId="Date" w:type="paragraph">
-    <w:name w:val="Date"/>
-    <w:next w:val="BodyText"/>
-    <w:qFormat/>
-    <w:pPr>
-      <w:keepNext/>
-      <w:keepLines/>
-      <w:jc w:val="center"/>
-    </w:pPr>
-  </w:style>
-  <w:style w:customStyle="1" w:styleId="AbstractTitle" w:type="paragraph">
-    <w:name w:val="Abstract Title"/>
-    <w:basedOn w:val="Normal"/>
-    <w:next w:val="Abstract"/>
-    <w:qFormat/>
-    <w:pPr>
-      <w:keepNext/>
-      <w:keepLines/>
-      <w:spacing w:after="0" w:before="300"/>
-      <w:jc w:val="center"/>
-    </w:pPr>
-    <w:rPr>
-      <w:b/>
-      <w:sz w:val="20"/>
-      <w:szCs w:val="20"/>
-    </w:rPr>
-  </w:style>
-  <w:style w:customStyle="1" w:styleId="Abstract" w:type="paragraph">
-    <w:name w:val="Abstract"/>
-    <w:basedOn w:val="Normal"/>
-    <w:next w:val="BodyText"/>
-    <w:qFormat/>
-    <w:pPr>
-      <w:keepNext/>
-      <w:keepLines/>
-      <w:spacing w:after="300" w:before="100"/>
-    </w:pPr>
-    <w:rPr>
-      <w:sz w:val="20"/>
-      <w:szCs w:val="20"/>
-    </w:rPr>
-  </w:style>
-  <w:style w:styleId="Bibliography" w:type="paragraph">
-    <w:name w:val="Bibliography"/>
-    <w:basedOn w:val="Normal"/>
-    <w:next w:val="Bibliography"/>
-    <w:qFormat/>
-    <w:pPr/>
-    <w:rPr/>
-  </w:style>
-  <w:style w:styleId="Heading1" w:type="paragraph">
+  <w:style w:type="paragraph" w:styleId="Heading1">
     <w:name w:val="heading 1"/>
     <w:basedOn w:val="Normal"/>
     <w:next w:val="BodyText"/>
@@ -605,17 +1190,17 @@
     <w:pPr>
       <w:keepNext/>
       <w:keepLines/>
-      <w:spacing w:after="80" w:before="360"/>
+      <w:spacing w:before="360" w:after="80"/>
       <w:outlineLvl w:val="0"/>
     </w:pPr>
     <w:rPr>
-      <w:rFonts w:asciiTheme="majorHAnsi" w:cstheme="majorBidi" w:eastAsiaTheme="majorEastAsia" w:hAnsiTheme="majorHAnsi"/>
-      <w:color w:themeColor="accent1" w:themeShade="BF" w:val="0F4761"/>
+      <w:rFonts w:asciiTheme="majorHAnsi" w:eastAsiaTheme="majorEastAsia" w:hAnsiTheme="majorHAnsi" w:cstheme="majorBidi"/>
+      <w:color w:val="0F4761" w:themeColor="accent1" w:themeShade="BF"/>
       <w:sz w:val="40"/>
       <w:szCs w:val="40"/>
     </w:rPr>
   </w:style>
-  <w:style w:styleId="Heading2" w:type="paragraph">
+  <w:style w:type="paragraph" w:styleId="Heading2">
     <w:name w:val="heading 2"/>
     <w:basedOn w:val="Normal"/>
     <w:next w:val="BodyText"/>
@@ -628,17 +1213,17 @@
     <w:pPr>
       <w:keepNext/>
       <w:keepLines/>
-      <w:spacing w:after="80" w:before="160"/>
+      <w:spacing w:before="160" w:after="80"/>
       <w:outlineLvl w:val="1"/>
     </w:pPr>
     <w:rPr>
-      <w:rFonts w:asciiTheme="majorHAnsi" w:cstheme="majorBidi" w:eastAsiaTheme="majorEastAsia" w:hAnsiTheme="majorHAnsi"/>
-      <w:color w:themeColor="accent1" w:themeShade="BF" w:val="0F4761"/>
+      <w:rFonts w:asciiTheme="majorHAnsi" w:eastAsiaTheme="majorEastAsia" w:hAnsiTheme="majorHAnsi" w:cstheme="majorBidi"/>
+      <w:color w:val="0F4761" w:themeColor="accent1" w:themeShade="BF"/>
       <w:sz w:val="32"/>
       <w:szCs w:val="32"/>
     </w:rPr>
   </w:style>
-  <w:style w:styleId="Heading3" w:type="paragraph">
+  <w:style w:type="paragraph" w:styleId="Heading3">
     <w:name w:val="heading 3"/>
     <w:basedOn w:val="Normal"/>
     <w:next w:val="BodyText"/>
@@ -651,17 +1236,17 @@
     <w:pPr>
       <w:keepNext/>
       <w:keepLines/>
-      <w:spacing w:after="80" w:before="160"/>
+      <w:spacing w:before="160" w:after="80"/>
       <w:outlineLvl w:val="2"/>
     </w:pPr>
     <w:rPr>
-      <w:rFonts w:cstheme="majorBidi" w:eastAsiaTheme="majorEastAsia"/>
-      <w:color w:themeColor="accent1" w:themeShade="BF" w:val="0F4761"/>
+      <w:rFonts w:eastAsiaTheme="majorEastAsia" w:cstheme="majorBidi"/>
+      <w:color w:val="0F4761" w:themeColor="accent1" w:themeShade="BF"/>
       <w:sz w:val="28"/>
       <w:szCs w:val="28"/>
     </w:rPr>
   </w:style>
-  <w:style w:styleId="Heading4" w:type="paragraph">
+  <w:style w:type="paragraph" w:styleId="Heading4">
     <w:name w:val="heading 4"/>
     <w:basedOn w:val="Normal"/>
     <w:next w:val="BodyText"/>
@@ -674,17 +1259,17 @@
     <w:pPr>
       <w:keepNext/>
       <w:keepLines/>
-      <w:spacing w:after="40" w:before="80"/>
+      <w:spacing w:before="80" w:after="40"/>
       <w:outlineLvl w:val="3"/>
     </w:pPr>
     <w:rPr>
-      <w:rFonts w:cstheme="majorBidi" w:eastAsiaTheme="majorEastAsia"/>
+      <w:rFonts w:eastAsiaTheme="majorEastAsia" w:cstheme="majorBidi"/>
       <w:i/>
       <w:iCs/>
-      <w:color w:themeColor="accent1" w:themeShade="BF" w:val="0F4761"/>
-    </w:rPr>
-  </w:style>
-  <w:style w:styleId="Heading5" w:type="paragraph">
+      <w:color w:val="0F4761" w:themeColor="accent1" w:themeShade="BF"/>
+    </w:rPr>
+  </w:style>
+  <w:style w:type="paragraph" w:styleId="Heading5">
     <w:name w:val="heading 5"/>
     <w:basedOn w:val="Normal"/>
     <w:next w:val="BodyText"/>
@@ -697,15 +1282,15 @@
     <w:pPr>
       <w:keepNext/>
       <w:keepLines/>
-      <w:spacing w:after="40" w:before="80"/>
+      <w:spacing w:before="80" w:after="40"/>
       <w:outlineLvl w:val="4"/>
     </w:pPr>
     <w:rPr>
-      <w:rFonts w:cstheme="majorBidi" w:eastAsiaTheme="majorEastAsia"/>
-      <w:color w:themeColor="accent1" w:themeShade="BF" w:val="0F4761"/>
-    </w:rPr>
-  </w:style>
-  <w:style w:styleId="Heading6" w:type="paragraph">
+      <w:rFonts w:eastAsiaTheme="majorEastAsia" w:cstheme="majorBidi"/>
+      <w:color w:val="0F4761" w:themeColor="accent1" w:themeShade="BF"/>
+    </w:rPr>
+  </w:style>
+  <w:style w:type="paragraph" w:styleId="Heading6">
     <w:name w:val="heading 6"/>
     <w:basedOn w:val="Normal"/>
     <w:next w:val="BodyText"/>
@@ -718,17 +1303,17 @@
     <w:pPr>
       <w:keepNext/>
       <w:keepLines/>
-      <w:spacing w:after="0" w:before="40"/>
+      <w:spacing w:before="40" w:after="0"/>
       <w:outlineLvl w:val="5"/>
     </w:pPr>
     <w:rPr>
-      <w:rFonts w:cstheme="majorBidi" w:eastAsiaTheme="majorEastAsia"/>
+      <w:rFonts w:eastAsiaTheme="majorEastAsia" w:cstheme="majorBidi"/>
       <w:i/>
       <w:iCs/>
-      <w:color w:themeColor="text1" w:themeTint="A6" w:val="595959"/>
-    </w:rPr>
-  </w:style>
-  <w:style w:styleId="Heading7" w:type="paragraph">
+      <w:color w:val="595959" w:themeColor="text1" w:themeTint="A6"/>
+    </w:rPr>
+  </w:style>
+  <w:style w:type="paragraph" w:styleId="Heading7">
     <w:name w:val="heading 7"/>
     <w:basedOn w:val="Normal"/>
     <w:next w:val="BodyText"/>
@@ -741,15 +1326,15 @@
     <w:pPr>
       <w:keepNext/>
       <w:keepLines/>
-      <w:spacing w:after="0" w:before="40"/>
+      <w:spacing w:before="40" w:after="0"/>
       <w:outlineLvl w:val="6"/>
     </w:pPr>
     <w:rPr>
-      <w:rFonts w:cstheme="majorBidi" w:eastAsiaTheme="majorEastAsia"/>
-      <w:color w:themeColor="text1" w:themeTint="A6" w:val="595959"/>
-    </w:rPr>
-  </w:style>
-  <w:style w:styleId="Heading8" w:type="paragraph">
+      <w:rFonts w:eastAsiaTheme="majorEastAsia" w:cstheme="majorBidi"/>
+      <w:color w:val="595959" w:themeColor="text1" w:themeTint="A6"/>
+    </w:rPr>
+  </w:style>
+  <w:style w:type="paragraph" w:styleId="Heading8">
     <w:name w:val="heading 8"/>
     <w:basedOn w:val="Normal"/>
     <w:next w:val="BodyText"/>
@@ -766,13 +1351,13 @@
       <w:outlineLvl w:val="7"/>
     </w:pPr>
     <w:rPr>
-      <w:rFonts w:cstheme="majorBidi" w:eastAsiaTheme="majorEastAsia"/>
+      <w:rFonts w:eastAsiaTheme="majorEastAsia" w:cstheme="majorBidi"/>
       <w:i/>
       <w:iCs/>
-      <w:color w:themeColor="text1" w:themeTint="D8" w:val="272727"/>
-    </w:rPr>
-  </w:style>
-  <w:style w:styleId="Heading9" w:type="paragraph">
+      <w:color w:val="272727" w:themeColor="text1" w:themeTint="D8"/>
+    </w:rPr>
+  </w:style>
+  <w:style w:type="paragraph" w:styleId="Heading9">
     <w:name w:val="heading 9"/>
     <w:basedOn w:val="Normal"/>
     <w:next w:val="BodyText"/>
@@ -789,24 +1374,197 @@
       <w:outlineLvl w:val="8"/>
     </w:pPr>
     <w:rPr>
-      <w:rFonts w:cstheme="majorBidi" w:eastAsiaTheme="majorEastAsia"/>
-      <w:color w:themeColor="text1" w:themeTint="D8" w:val="272727"/>
-    </w:rPr>
-  </w:style>
-  <w:style w:customStyle="1" w:styleId="Heading1Char" w:type="character">
+      <w:rFonts w:eastAsiaTheme="majorEastAsia" w:cstheme="majorBidi"/>
+      <w:color w:val="272727" w:themeColor="text1" w:themeTint="D8"/>
+    </w:rPr>
+  </w:style>
+  <w:style w:type="character" w:default="1" w:styleId="DefaultParagraphFont">
+    <w:name w:val="Default Paragraph Font"/>
+    <w:uiPriority w:val="1"/>
+    <w:unhideWhenUsed/>
+  </w:style>
+  <w:style w:type="table" w:default="1" w:styleId="TableNormal">
+    <w:name w:val="Normal Table"/>
+    <w:uiPriority w:val="99"/>
+    <w:semiHidden/>
+    <w:unhideWhenUsed/>
+    <w:tblPr>
+      <w:tblInd w:w="0" w:type="dxa"/>
+      <w:tblCellMar>
+        <w:top w:w="0" w:type="dxa"/>
+        <w:left w:w="108" w:type="dxa"/>
+        <w:bottom w:w="0" w:type="dxa"/>
+        <w:right w:w="108" w:type="dxa"/>
+      </w:tblCellMar>
+    </w:tblPr>
+  </w:style>
+  <w:style w:type="numbering" w:default="1" w:styleId="NoList">
+    <w:name w:val="No List"/>
+    <w:uiPriority w:val="99"/>
+    <w:semiHidden/>
+    <w:unhideWhenUsed/>
+  </w:style>
+  <w:style w:type="paragraph" w:styleId="BodyText">
+    <w:name w:val="Body Text"/>
+    <w:basedOn w:val="Normal"/>
+    <w:qFormat/>
+    <w:pPr>
+      <w:spacing w:before="180" w:after="180"/>
+    </w:pPr>
+  </w:style>
+  <w:style w:type="paragraph" w:customStyle="1" w:styleId="FirstParagraph">
+    <w:name w:val="First Paragraph"/>
+    <w:basedOn w:val="BodyText"/>
+    <w:next w:val="BodyText"/>
+    <w:qFormat/>
+  </w:style>
+  <w:style w:type="paragraph" w:customStyle="1" w:styleId="Compact">
+    <w:name w:val="Compact"/>
+    <w:basedOn w:val="BodyText"/>
+    <w:qFormat/>
+    <w:pPr>
+      <w:spacing w:before="36" w:after="36"/>
+    </w:pPr>
+  </w:style>
+  <w:style w:type="paragraph" w:styleId="Title">
+    <w:name w:val="Title"/>
+    <w:basedOn w:val="Normal"/>
+    <w:next w:val="BodyText"/>
+    <w:link w:val="TitleChar"/>
+    <w:uiPriority w:val="10"/>
+    <w:qFormat/>
+    <w:rsid w:val="00A10FD9"/>
+    <w:pPr>
+      <w:spacing w:after="80"/>
+      <w:contextualSpacing/>
+      <w:jc w:val="center"/>
+    </w:pPr>
+    <w:rPr>
+      <w:rFonts w:asciiTheme="majorHAnsi" w:eastAsiaTheme="majorEastAsia" w:hAnsiTheme="majorHAnsi" w:cstheme="majorBidi"/>
+      <w:spacing w:val="-10"/>
+      <w:kern w:val="28"/>
+      <w:sz w:val="56"/>
+      <w:szCs w:val="56"/>
+    </w:rPr>
+  </w:style>
+  <w:style w:type="character" w:customStyle="1" w:styleId="TitleChar">
+    <w:name w:val="Title Char"/>
+    <w:basedOn w:val="DefaultParagraphFont"/>
+    <w:link w:val="Title"/>
+    <w:uiPriority w:val="10"/>
+    <w:rsid w:val="00A10FD9"/>
+    <w:rPr>
+      <w:rFonts w:asciiTheme="majorHAnsi" w:eastAsiaTheme="majorEastAsia" w:hAnsiTheme="majorHAnsi" w:cstheme="majorBidi"/>
+      <w:spacing w:val="-10"/>
+      <w:kern w:val="28"/>
+      <w:sz w:val="56"/>
+      <w:szCs w:val="56"/>
+    </w:rPr>
+  </w:style>
+  <w:style w:type="paragraph" w:styleId="Subtitle">
+    <w:name w:val="Subtitle"/>
+    <w:basedOn w:val="Title"/>
+    <w:next w:val="BodyText"/>
+    <w:link w:val="SubtitleChar"/>
+    <w:uiPriority w:val="11"/>
+    <w:qFormat/>
+    <w:rsid w:val="00A10FD9"/>
+    <w:pPr>
+      <w:numPr>
+        <w:ilvl w:val="1"/>
+      </w:numPr>
+    </w:pPr>
+    <w:rPr>
+      <w:spacing w:val="15"/>
+      <w:sz w:val="28"/>
+      <w:szCs w:val="28"/>
+    </w:rPr>
+  </w:style>
+  <w:style w:type="character" w:customStyle="1" w:styleId="SubtitleChar">
+    <w:name w:val="Subtitle Char"/>
+    <w:basedOn w:val="DefaultParagraphFont"/>
+    <w:link w:val="Subtitle"/>
+    <w:uiPriority w:val="11"/>
+    <w:rsid w:val="00A10FD9"/>
+    <w:rPr>
+      <w:rFonts w:eastAsiaTheme="majorEastAsia" w:cstheme="majorBidi"/>
+      <w:color w:val="595959" w:themeColor="text1" w:themeTint="A6"/>
+      <w:spacing w:val="15"/>
+      <w:sz w:val="28"/>
+      <w:szCs w:val="28"/>
+    </w:rPr>
+  </w:style>
+  <w:style w:type="paragraph" w:customStyle="1" w:styleId="Author">
+    <w:name w:val="Author"/>
+    <w:next w:val="BodyText"/>
+    <w:qFormat/>
+    <w:pPr>
+      <w:keepNext/>
+      <w:keepLines/>
+      <w:jc w:val="center"/>
+    </w:pPr>
+  </w:style>
+  <w:style w:type="paragraph" w:styleId="Date">
+    <w:name w:val="Date"/>
+    <w:next w:val="BodyText"/>
+    <w:qFormat/>
+    <w:pPr>
+      <w:keepNext/>
+      <w:keepLines/>
+      <w:jc w:val="center"/>
+    </w:pPr>
+  </w:style>
+  <w:style w:type="paragraph" w:customStyle="1" w:styleId="AbstractTitle">
+    <w:name w:val="Abstract Title"/>
+    <w:basedOn w:val="Normal"/>
+    <w:next w:val="Abstract"/>
+    <w:qFormat/>
+    <w:pPr>
+      <w:keepNext/>
+      <w:keepLines/>
+      <w:spacing w:before="300" w:after="0"/>
+      <w:jc w:val="center"/>
+    </w:pPr>
+    <w:rPr>
+      <w:b/>
+      <w:sz w:val="20"/>
+      <w:szCs w:val="20"/>
+    </w:rPr>
+  </w:style>
+  <w:style w:type="paragraph" w:customStyle="1" w:styleId="Abstract">
+    <w:name w:val="Abstract"/>
+    <w:basedOn w:val="Normal"/>
+    <w:next w:val="BodyText"/>
+    <w:qFormat/>
+    <w:pPr>
+      <w:keepNext/>
+      <w:keepLines/>
+      <w:spacing w:before="100" w:after="300"/>
+    </w:pPr>
+    <w:rPr>
+      <w:sz w:val="20"/>
+      <w:szCs w:val="20"/>
+    </w:rPr>
+  </w:style>
+  <w:style w:type="paragraph" w:styleId="Bibliography">
+    <w:name w:val="Bibliography"/>
+    <w:basedOn w:val="Normal"/>
+    <w:qFormat/>
+  </w:style>
+  <w:style w:type="character" w:customStyle="1" w:styleId="Heading1Char">
     <w:name w:val="Heading 1 Char"/>
     <w:basedOn w:val="DefaultParagraphFont"/>
     <w:link w:val="Heading1"/>
     <w:uiPriority w:val="9"/>
     <w:rsid w:val="00A10FD9"/>
     <w:rPr>
-      <w:rFonts w:asciiTheme="majorHAnsi" w:cstheme="majorBidi" w:eastAsiaTheme="majorEastAsia" w:hAnsiTheme="majorHAnsi"/>
-      <w:color w:themeColor="accent1" w:themeShade="BF" w:val="0F4761"/>
+      <w:rFonts w:asciiTheme="majorHAnsi" w:eastAsiaTheme="majorEastAsia" w:hAnsiTheme="majorHAnsi" w:cstheme="majorBidi"/>
+      <w:color w:val="0F4761" w:themeColor="accent1" w:themeShade="BF"/>
       <w:sz w:val="40"/>
       <w:szCs w:val="40"/>
     </w:rPr>
   </w:style>
-  <w:style w:customStyle="1" w:styleId="Heading2Char" w:type="character">
+  <w:style w:type="character" w:customStyle="1" w:styleId="Heading2Char">
     <w:name w:val="Heading 2 Char"/>
     <w:basedOn w:val="DefaultParagraphFont"/>
     <w:link w:val="Heading2"/>
@@ -814,13 +1572,13 @@
     <w:semiHidden/>
     <w:rsid w:val="00A10FD9"/>
     <w:rPr>
-      <w:rFonts w:asciiTheme="majorHAnsi" w:cstheme="majorBidi" w:eastAsiaTheme="majorEastAsia" w:hAnsiTheme="majorHAnsi"/>
-      <w:color w:themeColor="accent1" w:themeShade="BF" w:val="0F4761"/>
+      <w:rFonts w:asciiTheme="majorHAnsi" w:eastAsiaTheme="majorEastAsia" w:hAnsiTheme="majorHAnsi" w:cstheme="majorBidi"/>
+      <w:color w:val="0F4761" w:themeColor="accent1" w:themeShade="BF"/>
       <w:sz w:val="32"/>
       <w:szCs w:val="32"/>
     </w:rPr>
   </w:style>
-  <w:style w:customStyle="1" w:styleId="Heading3Char" w:type="character">
+  <w:style w:type="character" w:customStyle="1" w:styleId="Heading3Char">
     <w:name w:val="Heading 3 Char"/>
     <w:basedOn w:val="DefaultParagraphFont"/>
     <w:link w:val="Heading3"/>
@@ -828,13 +1586,13 @@
     <w:semiHidden/>
     <w:rsid w:val="00A10FD9"/>
     <w:rPr>
-      <w:rFonts w:cstheme="majorBidi" w:eastAsiaTheme="majorEastAsia"/>
-      <w:color w:themeColor="accent1" w:themeShade="BF" w:val="0F4761"/>
+      <w:rFonts w:eastAsiaTheme="majorEastAsia" w:cstheme="majorBidi"/>
+      <w:color w:val="0F4761" w:themeColor="accent1" w:themeShade="BF"/>
       <w:sz w:val="28"/>
       <w:szCs w:val="28"/>
     </w:rPr>
   </w:style>
-  <w:style w:customStyle="1" w:styleId="Heading4Char" w:type="character">
+  <w:style w:type="character" w:customStyle="1" w:styleId="Heading4Char">
     <w:name w:val="Heading 4 Char"/>
     <w:basedOn w:val="DefaultParagraphFont"/>
     <w:link w:val="Heading4"/>
@@ -842,13 +1600,13 @@
     <w:semiHidden/>
     <w:rsid w:val="00A10FD9"/>
     <w:rPr>
-      <w:rFonts w:cstheme="majorBidi" w:eastAsiaTheme="majorEastAsia"/>
+      <w:rFonts w:eastAsiaTheme="majorEastAsia" w:cstheme="majorBidi"/>
       <w:i/>
       <w:iCs/>
-      <w:color w:themeColor="accent1" w:themeShade="BF" w:val="0F4761"/>
-    </w:rPr>
-  </w:style>
-  <w:style w:customStyle="1" w:styleId="Heading5Char" w:type="character">
+      <w:color w:val="0F4761" w:themeColor="accent1" w:themeShade="BF"/>
+    </w:rPr>
+  </w:style>
+  <w:style w:type="character" w:customStyle="1" w:styleId="Heading5Char">
     <w:name w:val="Heading 5 Char"/>
     <w:basedOn w:val="DefaultParagraphFont"/>
     <w:link w:val="Heading5"/>
@@ -856,11 +1614,11 @@
     <w:semiHidden/>
     <w:rsid w:val="00A10FD9"/>
     <w:rPr>
-      <w:rFonts w:cstheme="majorBidi" w:eastAsiaTheme="majorEastAsia"/>
-      <w:color w:themeColor="accent1" w:themeShade="BF" w:val="0F4761"/>
-    </w:rPr>
-  </w:style>
-  <w:style w:customStyle="1" w:styleId="Heading6Char" w:type="character">
+      <w:rFonts w:eastAsiaTheme="majorEastAsia" w:cstheme="majorBidi"/>
+      <w:color w:val="0F4761" w:themeColor="accent1" w:themeShade="BF"/>
+    </w:rPr>
+  </w:style>
+  <w:style w:type="character" w:customStyle="1" w:styleId="Heading6Char">
     <w:name w:val="Heading 6 Char"/>
     <w:basedOn w:val="DefaultParagraphFont"/>
     <w:link w:val="Heading6"/>
@@ -868,13 +1626,13 @@
     <w:semiHidden/>
     <w:rsid w:val="00A10FD9"/>
     <w:rPr>
-      <w:rFonts w:cstheme="majorBidi" w:eastAsiaTheme="majorEastAsia"/>
+      <w:rFonts w:eastAsiaTheme="majorEastAsia" w:cstheme="majorBidi"/>
       <w:i/>
       <w:iCs/>
-      <w:color w:themeColor="text1" w:themeTint="A6" w:val="595959"/>
-    </w:rPr>
-  </w:style>
-  <w:style w:customStyle="1" w:styleId="Heading7Char" w:type="character">
+      <w:color w:val="595959" w:themeColor="text1" w:themeTint="A6"/>
+    </w:rPr>
+  </w:style>
+  <w:style w:type="character" w:customStyle="1" w:styleId="Heading7Char">
     <w:name w:val="Heading 7 Char"/>
     <w:basedOn w:val="DefaultParagraphFont"/>
     <w:link w:val="Heading7"/>
@@ -882,11 +1640,11 @@
     <w:semiHidden/>
     <w:rsid w:val="00A10FD9"/>
     <w:rPr>
-      <w:rFonts w:cstheme="majorBidi" w:eastAsiaTheme="majorEastAsia"/>
-      <w:color w:themeColor="text1" w:themeTint="A6" w:val="595959"/>
-    </w:rPr>
-  </w:style>
-  <w:style w:customStyle="1" w:styleId="Heading8Char" w:type="character">
+      <w:rFonts w:eastAsiaTheme="majorEastAsia" w:cstheme="majorBidi"/>
+      <w:color w:val="595959" w:themeColor="text1" w:themeTint="A6"/>
+    </w:rPr>
+  </w:style>
+  <w:style w:type="character" w:customStyle="1" w:styleId="Heading8Char">
     <w:name w:val="Heading 8 Char"/>
     <w:basedOn w:val="DefaultParagraphFont"/>
     <w:link w:val="Heading8"/>
@@ -894,13 +1652,13 @@
     <w:semiHidden/>
     <w:rsid w:val="00A10FD9"/>
     <w:rPr>
-      <w:rFonts w:cstheme="majorBidi" w:eastAsiaTheme="majorEastAsia"/>
+      <w:rFonts w:eastAsiaTheme="majorEastAsia" w:cstheme="majorBidi"/>
       <w:i/>
       <w:iCs/>
-      <w:color w:themeColor="text1" w:themeTint="D8" w:val="272727"/>
-    </w:rPr>
-  </w:style>
-  <w:style w:customStyle="1" w:styleId="Heading9Char" w:type="character">
+      <w:color w:val="272727" w:themeColor="text1" w:themeTint="D8"/>
+    </w:rPr>
+  </w:style>
+  <w:style w:type="character" w:customStyle="1" w:styleId="Heading9Char">
     <w:name w:val="Heading 9 Char"/>
     <w:basedOn w:val="DefaultParagraphFont"/>
     <w:link w:val="Heading9"/>
@@ -908,11 +1666,11 @@
     <w:semiHidden/>
     <w:rsid w:val="00A10FD9"/>
     <w:rPr>
-      <w:rFonts w:cstheme="majorBidi" w:eastAsiaTheme="majorEastAsia"/>
-      <w:color w:themeColor="text1" w:themeTint="D8" w:val="272727"/>
-    </w:rPr>
-  </w:style>
-  <w:style w:styleId="BlockText" w:type="paragraph">
+      <w:rFonts w:eastAsiaTheme="majorEastAsia" w:cstheme="majorBidi"/>
+      <w:color w:val="272727" w:themeColor="text1" w:themeTint="D8"/>
+    </w:rPr>
+  </w:style>
+  <w:style w:type="paragraph" w:styleId="BlockText">
     <w:name w:val="Block Text"/>
     <w:basedOn w:val="BodyText"/>
     <w:next w:val="BodyText"/>
@@ -920,19 +1678,18 @@
     <w:unhideWhenUsed/>
     <w:qFormat/>
     <w:pPr>
-      <w:spacing w:after="100" w:before="100"/>
-      <w:ind w:firstLine="0" w:left="480" w:right="480"/>
-    </w:pPr>
-  </w:style>
-  <w:style w:styleId="FootnoteText" w:type="paragraph">
-    <w:name w:val="Footnote Text"/>
+      <w:spacing w:before="100" w:after="100"/>
+      <w:ind w:left="480" w:right="480"/>
+    </w:pPr>
+  </w:style>
+  <w:style w:type="paragraph" w:styleId="FootnoteText">
+    <w:name w:val="footnote text"/>
     <w:basedOn w:val="Normal"/>
-    <w:next w:val="FootnoteText"/>
     <w:uiPriority w:val="9"/>
     <w:unhideWhenUsed/>
     <w:qFormat/>
   </w:style>
-  <w:style w:styleId="FootnoteBlockText" w:type="paragraph">
+  <w:style w:type="paragraph" w:customStyle="1" w:styleId="FootnoteBlockText">
     <w:name w:val="Footnote Block Text"/>
     <w:basedOn w:val="FootnoteText"/>
     <w:next w:val="FootnoteText"/>
@@ -940,47 +1697,40 @@
     <w:unhideWhenUsed/>
     <w:qFormat/>
     <w:pPr>
-      <w:spacing w:after="100" w:before="100"/>
-      <w:ind w:firstLine="0" w:left="480" w:right="480"/>
-    </w:pPr>
-  </w:style>
-  <w:style w:default="1" w:styleId="DefaultParagraphFont" w:type="character">
-    <w:name w:val="Default Paragraph Font"/>
-    <w:semiHidden/>
-    <w:unhideWhenUsed/>
-  </w:style>
-  <w:style w:default="1" w:styleId="Table" w:type="table">
+      <w:spacing w:before="100" w:after="100"/>
+      <w:ind w:left="480" w:right="480"/>
+    </w:pPr>
+  </w:style>
+  <w:style w:type="table" w:customStyle="1" w:styleId="Table">
     <w:name w:val="Table"/>
-    <w:basedOn w:val="TableNormal"/>
     <w:semiHidden/>
     <w:unhideWhenUsed/>
     <w:qFormat/>
     <w:tblPr>
-      <w:tblInd w:type="dxa" w:w="0"/>
+      <w:tblInd w:w="0" w:type="dxa"/>
       <w:tblCellMar>
-        <w:top w:type="dxa" w:w="0"/>
-        <w:left w:type="dxa" w:w="108"/>
-        <w:bottom w:type="dxa" w:w="0"/>
-        <w:right w:type="dxa" w:w="108"/>
+        <w:top w:w="0" w:type="dxa"/>
+        <w:left w:w="108" w:type="dxa"/>
+        <w:bottom w:w="0" w:type="dxa"/>
+        <w:right w:w="108" w:type="dxa"/>
       </w:tblCellMar>
     </w:tblPr>
     <w:tblStylePr w:type="firstRow">
       <w:tblPr>
         <w:jc w:val="left"/>
-        <w:tblInd w:type="dxa" w:w="0"/>
       </w:tblPr>
       <w:trPr>
         <w:jc w:val="left"/>
       </w:trPr>
       <w:tcPr>
         <w:tcBorders>
-          <w:bottom w:val="single"/>
+          <w:bottom w:val="single" w:sz="0" w:space="0" w:color="auto"/>
         </w:tcBorders>
         <w:vAlign w:val="bottom"/>
       </w:tcPr>
     </w:tblStylePr>
   </w:style>
-  <w:style w:customStyle="1" w:styleId="DefinitionTerm" w:type="paragraph">
+  <w:style w:type="paragraph" w:customStyle="1" w:styleId="DefinitionTerm">
     <w:name w:val="Definition Term"/>
     <w:basedOn w:val="Normal"/>
     <w:next w:val="Definition"/>
@@ -993,75 +1743,76 @@
       <w:b/>
     </w:rPr>
   </w:style>
-  <w:style w:customStyle="1" w:styleId="Definition" w:type="paragraph">
+  <w:style w:type="paragraph" w:customStyle="1" w:styleId="Definition">
     <w:name w:val="Definition"/>
     <w:basedOn w:val="Normal"/>
   </w:style>
-  <w:style w:styleId="Caption" w:type="paragraph">
-    <w:name w:val="Caption"/>
+  <w:style w:type="paragraph" w:styleId="Caption">
+    <w:name w:val="caption"/>
     <w:basedOn w:val="Normal"/>
-    <w:link w:val="BodyTextChar"/>
-    <w:pPr>
-      <w:spacing w:after="120" w:before="0"/>
+    <w:link w:val="CaptionChar"/>
+    <w:pPr>
+      <w:spacing w:after="120"/>
     </w:pPr>
     <w:rPr>
       <w:i/>
     </w:rPr>
   </w:style>
-  <w:style w:customStyle="1" w:styleId="TableCaption" w:type="paragraph">
+  <w:style w:type="paragraph" w:customStyle="1" w:styleId="TableCaption">
     <w:name w:val="Table Caption"/>
     <w:basedOn w:val="Caption"/>
     <w:pPr>
       <w:keepNext/>
     </w:pPr>
   </w:style>
-  <w:style w:customStyle="1" w:styleId="ImageCaption" w:type="paragraph">
+  <w:style w:type="paragraph" w:customStyle="1" w:styleId="ImageCaption">
     <w:name w:val="Image Caption"/>
     <w:basedOn w:val="Caption"/>
   </w:style>
-  <w:style w:customStyle="1" w:styleId="Figure" w:type="paragraph">
+  <w:style w:type="paragraph" w:customStyle="1" w:styleId="Figure">
     <w:name w:val="Figure"/>
     <w:basedOn w:val="Normal"/>
   </w:style>
-  <w:style w:customStyle="1" w:styleId="CaptionedFigure" w:type="paragraph">
+  <w:style w:type="paragraph" w:customStyle="1" w:styleId="CaptionedFigure">
     <w:name w:val="Captioned Figure"/>
     <w:basedOn w:val="Figure"/>
     <w:pPr>
       <w:keepNext/>
     </w:pPr>
   </w:style>
-  <w:style w:customStyle="1" w:styleId="BodyTextChar" w:type="character">
-    <w:name w:val="Body Text Char"/>
+  <w:style w:type="character" w:customStyle="1" w:styleId="CaptionChar">
+    <w:name w:val="Caption Char"/>
     <w:basedOn w:val="DefaultParagraphFont"/>
-    <w:link w:val="BodyText"/>
-  </w:style>
-  <w:style w:customStyle="1" w:styleId="VerbatimChar" w:type="character">
+    <w:link w:val="Caption"/>
+  </w:style>
+  <w:style w:type="character" w:customStyle="1" w:styleId="VerbatimChar">
     <w:name w:val="Verbatim Char"/>
-    <w:basedOn w:val="BodyTextChar"/>
-    <w:rPr>
-      <w:rFonts w:ascii="Consolas" w:hAnsi="Consolas"/>
-      <w:sz w:val="22"/>
-    </w:rPr>
-  </w:style>
-  <w:style w:customStyle="1" w:styleId="SectionNumber" w:type="character">
+    <w:basedOn w:val="CaptionChar"/>
+    <w:link w:val="SourceCode"/>
+    <w:rPr>
+      <w:rFonts w:ascii="Consolas" w:hAnsi="Consolas"/>
+      <w:sz w:val="22"/>
+    </w:rPr>
+  </w:style>
+  <w:style w:type="character" w:customStyle="1" w:styleId="SectionNumber">
     <w:name w:val="Section Number"/>
-    <w:basedOn w:val="BodyTextChar"/>
-  </w:style>
-  <w:style w:styleId="FootnoteReference" w:type="character">
-    <w:name w:val="Footnote Reference"/>
-    <w:basedOn w:val="BodyTextChar"/>
+    <w:basedOn w:val="CaptionChar"/>
+  </w:style>
+  <w:style w:type="character" w:styleId="FootnoteReference">
+    <w:name w:val="footnote reference"/>
+    <w:basedOn w:val="CaptionChar"/>
     <w:rPr>
       <w:vertAlign w:val="superscript"/>
     </w:rPr>
   </w:style>
-  <w:style w:styleId="Hyperlink" w:type="character">
+  <w:style w:type="character" w:styleId="Hyperlink">
     <w:name w:val="Hyperlink"/>
-    <w:basedOn w:val="BodyTextChar"/>
-    <w:rPr>
-      <w:color w:themeColor="accent1" w:val="4F81BD"/>
-    </w:rPr>
-  </w:style>
-  <w:style w:styleId="TOCHeading" w:type="paragraph">
+    <w:basedOn w:val="CaptionChar"/>
+    <w:rPr>
+      <w:color w:val="156082" w:themeColor="accent1"/>
+    </w:rPr>
+  </w:style>
+  <w:style w:type="paragraph" w:styleId="TOCHeading">
     <w:name w:val="TOC Heading"/>
     <w:basedOn w:val="Heading1"/>
     <w:next w:val="BodyText"/>
@@ -1072,282 +1823,378 @@
       <w:spacing w:before="240" w:line="259" w:lineRule="auto"/>
       <w:outlineLvl w:val="9"/>
     </w:pPr>
-    <w:rPr>
-      <w:rFonts w:asciiTheme="majorHAnsi" w:cstheme="majorBidi" w:eastAsiaTheme="majorEastAsia" w:hAnsiTheme="majorHAnsi"/>
-      <w:b w:val="0"/>
-      <w:bCs w:val="0"/>
-      <w:color w:themeColor="accent1" w:themeShade="BF" w:val="365F91"/>
-    </w:rPr>
   </w:style>
   <w:style w:type="paragraph" w:customStyle="1" w:styleId="SourceCode">
     <w:name w:val="Source Code"/>
     <w:basedOn w:val="Normal"/>
     <w:link w:val="VerbatimChar"/>
     <w:pPr>
-      <w:wordWrap w:val="off"/>
-      <w:shd w:val="clear" w:fill="f8f8f8"/>
+      <w:shd w:val="clear" w:color="auto" w:fill="F8F8F8"/>
+      <w:wordWrap w:val="0"/>
     </w:pPr>
   </w:style>
   <w:style w:type="character" w:customStyle="1" w:styleId="KeywordTok">
     <w:name w:val="KeywordTok"/>
     <w:basedOn w:val="VerbatimChar"/>
     <w:rPr>
+      <w:rFonts w:ascii="Consolas" w:hAnsi="Consolas"/>
       <w:b/>
-      <w:color w:val="204a87"/>
-      <w:shd w:val="clear" w:fill="f8f8f8"/>
+      <w:color w:val="204A87"/>
+      <w:sz w:val="22"/>
+      <w:shd w:val="clear" w:color="auto" w:fill="F8F8F8"/>
     </w:rPr>
   </w:style>
   <w:style w:type="character" w:customStyle="1" w:styleId="DataTypeTok">
     <w:name w:val="DataTypeTok"/>
     <w:basedOn w:val="VerbatimChar"/>
     <w:rPr>
-      <w:color w:val="204a87"/>
-      <w:shd w:val="clear" w:fill="f8f8f8"/>
+      <w:rFonts w:ascii="Consolas" w:hAnsi="Consolas"/>
+      <w:color w:val="204A87"/>
+      <w:sz w:val="22"/>
+      <w:shd w:val="clear" w:color="auto" w:fill="F8F8F8"/>
     </w:rPr>
   </w:style>
   <w:style w:type="character" w:customStyle="1" w:styleId="DecValTok">
     <w:name w:val="DecValTok"/>
     <w:basedOn w:val="VerbatimChar"/>
     <w:rPr>
-      <w:color w:val="0000cf"/>
-      <w:shd w:val="clear" w:fill="f8f8f8"/>
+      <w:rFonts w:ascii="Consolas" w:hAnsi="Consolas"/>
+      <w:color w:val="0000CF"/>
+      <w:sz w:val="22"/>
+      <w:shd w:val="clear" w:color="auto" w:fill="F8F8F8"/>
     </w:rPr>
   </w:style>
   <w:style w:type="character" w:customStyle="1" w:styleId="BaseNTok">
     <w:name w:val="BaseNTok"/>
     <w:basedOn w:val="VerbatimChar"/>
     <w:rPr>
-      <w:color w:val="0000cf"/>
-      <w:shd w:val="clear" w:fill="f8f8f8"/>
+      <w:rFonts w:ascii="Consolas" w:hAnsi="Consolas"/>
+      <w:color w:val="0000CF"/>
+      <w:sz w:val="22"/>
+      <w:shd w:val="clear" w:color="auto" w:fill="F8F8F8"/>
     </w:rPr>
   </w:style>
   <w:style w:type="character" w:customStyle="1" w:styleId="FloatTok">
     <w:name w:val="FloatTok"/>
     <w:basedOn w:val="VerbatimChar"/>
     <w:rPr>
-      <w:color w:val="0000cf"/>
-      <w:shd w:val="clear" w:fill="f8f8f8"/>
+      <w:rFonts w:ascii="Consolas" w:hAnsi="Consolas"/>
+      <w:color w:val="0000CF"/>
+      <w:sz w:val="22"/>
+      <w:shd w:val="clear" w:color="auto" w:fill="F8F8F8"/>
     </w:rPr>
   </w:style>
   <w:style w:type="character" w:customStyle="1" w:styleId="ConstantTok">
     <w:name w:val="ConstantTok"/>
     <w:basedOn w:val="VerbatimChar"/>
     <w:rPr>
-      <w:color w:val="8f5902"/>
-      <w:shd w:val="clear" w:fill="f8f8f8"/>
+      <w:rFonts w:ascii="Consolas" w:hAnsi="Consolas"/>
+      <w:color w:val="8F5902"/>
+      <w:sz w:val="22"/>
+      <w:shd w:val="clear" w:color="auto" w:fill="F8F8F8"/>
     </w:rPr>
   </w:style>
   <w:style w:type="character" w:customStyle="1" w:styleId="CharTok">
     <w:name w:val="CharTok"/>
     <w:basedOn w:val="VerbatimChar"/>
     <w:rPr>
-      <w:color w:val="4e9a06"/>
-      <w:shd w:val="clear" w:fill="f8f8f8"/>
+      <w:rFonts w:ascii="Consolas" w:hAnsi="Consolas"/>
+      <w:color w:val="4E9A06"/>
+      <w:sz w:val="22"/>
+      <w:shd w:val="clear" w:color="auto" w:fill="F8F8F8"/>
     </w:rPr>
   </w:style>
   <w:style w:type="character" w:customStyle="1" w:styleId="SpecialCharTok">
     <w:name w:val="SpecialCharTok"/>
     <w:basedOn w:val="VerbatimChar"/>
     <w:rPr>
+      <w:rFonts w:ascii="Consolas" w:hAnsi="Consolas"/>
       <w:b/>
-      <w:color w:val="ce5c00"/>
-      <w:shd w:val="clear" w:fill="f8f8f8"/>
+      <w:color w:val="CE5C00"/>
+      <w:sz w:val="22"/>
+      <w:shd w:val="clear" w:color="auto" w:fill="F8F8F8"/>
     </w:rPr>
   </w:style>
   <w:style w:type="character" w:customStyle="1" w:styleId="StringTok">
     <w:name w:val="StringTok"/>
     <w:basedOn w:val="VerbatimChar"/>
     <w:rPr>
-      <w:color w:val="4e9a06"/>
-      <w:shd w:val="clear" w:fill="f8f8f8"/>
+      <w:rFonts w:ascii="Consolas" w:hAnsi="Consolas"/>
+      <w:color w:val="4E9A06"/>
+      <w:sz w:val="22"/>
+      <w:shd w:val="clear" w:color="auto" w:fill="F8F8F8"/>
     </w:rPr>
   </w:style>
   <w:style w:type="character" w:customStyle="1" w:styleId="VerbatimStringTok">
     <w:name w:val="VerbatimStringTok"/>
     <w:basedOn w:val="VerbatimChar"/>
     <w:rPr>
-      <w:color w:val="4e9a06"/>
-      <w:shd w:val="clear" w:fill="f8f8f8"/>
+      <w:rFonts w:ascii="Consolas" w:hAnsi="Consolas"/>
+      <w:color w:val="4E9A06"/>
+      <w:sz w:val="22"/>
+      <w:shd w:val="clear" w:color="auto" w:fill="F8F8F8"/>
     </w:rPr>
   </w:style>
   <w:style w:type="character" w:customStyle="1" w:styleId="SpecialStringTok">
     <w:name w:val="SpecialStringTok"/>
     <w:basedOn w:val="VerbatimChar"/>
     <w:rPr>
-      <w:color w:val="4e9a06"/>
-      <w:shd w:val="clear" w:fill="f8f8f8"/>
+      <w:rFonts w:ascii="Consolas" w:hAnsi="Consolas"/>
+      <w:color w:val="4E9A06"/>
+      <w:sz w:val="22"/>
+      <w:shd w:val="clear" w:color="auto" w:fill="F8F8F8"/>
     </w:rPr>
   </w:style>
   <w:style w:type="character" w:customStyle="1" w:styleId="ImportTok">
     <w:name w:val="ImportTok"/>
     <w:basedOn w:val="VerbatimChar"/>
     <w:rPr>
-      <w:shd w:val="clear" w:fill="f8f8f8"/>
+      <w:rFonts w:ascii="Consolas" w:hAnsi="Consolas"/>
+      <w:sz w:val="22"/>
+      <w:shd w:val="clear" w:color="auto" w:fill="F8F8F8"/>
     </w:rPr>
   </w:style>
   <w:style w:type="character" w:customStyle="1" w:styleId="CommentTok">
     <w:name w:val="CommentTok"/>
     <w:basedOn w:val="VerbatimChar"/>
     <w:rPr>
+      <w:rFonts w:ascii="Consolas" w:hAnsi="Consolas"/>
       <w:i/>
-      <w:color w:val="8f5902"/>
-      <w:shd w:val="clear" w:fill="f8f8f8"/>
+      <w:color w:val="8F5902"/>
+      <w:sz w:val="22"/>
+      <w:shd w:val="clear" w:color="auto" w:fill="F8F8F8"/>
     </w:rPr>
   </w:style>
   <w:style w:type="character" w:customStyle="1" w:styleId="DocumentationTok">
     <w:name w:val="DocumentationTok"/>
     <w:basedOn w:val="VerbatimChar"/>
     <w:rPr>
+      <w:rFonts w:ascii="Consolas" w:hAnsi="Consolas"/>
       <w:b/>
       <w:i/>
-      <w:color w:val="8f5902"/>
-      <w:shd w:val="clear" w:fill="f8f8f8"/>
+      <w:color w:val="8F5902"/>
+      <w:sz w:val="22"/>
+      <w:shd w:val="clear" w:color="auto" w:fill="F8F8F8"/>
     </w:rPr>
   </w:style>
   <w:style w:type="character" w:customStyle="1" w:styleId="AnnotationTok">
     <w:name w:val="AnnotationTok"/>
     <w:basedOn w:val="VerbatimChar"/>
     <w:rPr>
+      <w:rFonts w:ascii="Consolas" w:hAnsi="Consolas"/>
       <w:b/>
       <w:i/>
-      <w:color w:val="8f5902"/>
-      <w:shd w:val="clear" w:fill="f8f8f8"/>
+      <w:color w:val="8F5902"/>
+      <w:sz w:val="22"/>
+      <w:shd w:val="clear" w:color="auto" w:fill="F8F8F8"/>
     </w:rPr>
   </w:style>
   <w:style w:type="character" w:customStyle="1" w:styleId="CommentVarTok">
     <w:name w:val="CommentVarTok"/>
     <w:basedOn w:val="VerbatimChar"/>
     <w:rPr>
+      <w:rFonts w:ascii="Consolas" w:hAnsi="Consolas"/>
       <w:b/>
       <w:i/>
-      <w:color w:val="8f5902"/>
-      <w:shd w:val="clear" w:fill="f8f8f8"/>
+      <w:color w:val="8F5902"/>
+      <w:sz w:val="22"/>
+      <w:shd w:val="clear" w:color="auto" w:fill="F8F8F8"/>
     </w:rPr>
   </w:style>
   <w:style w:type="character" w:customStyle="1" w:styleId="OtherTok">
     <w:name w:val="OtherTok"/>
     <w:basedOn w:val="VerbatimChar"/>
     <w:rPr>
-      <w:color w:val="8f5902"/>
-      <w:shd w:val="clear" w:fill="f8f8f8"/>
+      <w:rFonts w:ascii="Consolas" w:hAnsi="Consolas"/>
+      <w:color w:val="8F5902"/>
+      <w:sz w:val="22"/>
+      <w:shd w:val="clear" w:color="auto" w:fill="F8F8F8"/>
     </w:rPr>
   </w:style>
   <w:style w:type="character" w:customStyle="1" w:styleId="FunctionTok">
     <w:name w:val="FunctionTok"/>
     <w:basedOn w:val="VerbatimChar"/>
     <w:rPr>
+      <w:rFonts w:ascii="Consolas" w:hAnsi="Consolas"/>
       <w:b/>
-      <w:color w:val="204a87"/>
-      <w:shd w:val="clear" w:fill="f8f8f8"/>
+      <w:color w:val="204A87"/>
+      <w:sz w:val="22"/>
+      <w:shd w:val="clear" w:color="auto" w:fill="F8F8F8"/>
     </w:rPr>
   </w:style>
   <w:style w:type="character" w:customStyle="1" w:styleId="VariableTok">
     <w:name w:val="VariableTok"/>
     <w:basedOn w:val="VerbatimChar"/>
     <w:rPr>
+      <w:rFonts w:ascii="Consolas" w:hAnsi="Consolas"/>
       <w:color w:val="000000"/>
-      <w:shd w:val="clear" w:fill="f8f8f8"/>
+      <w:sz w:val="22"/>
+      <w:shd w:val="clear" w:color="auto" w:fill="F8F8F8"/>
     </w:rPr>
   </w:style>
   <w:style w:type="character" w:customStyle="1" w:styleId="ControlFlowTok">
     <w:name w:val="ControlFlowTok"/>
     <w:basedOn w:val="VerbatimChar"/>
     <w:rPr>
+      <w:rFonts w:ascii="Consolas" w:hAnsi="Consolas"/>
       <w:b/>
-      <w:color w:val="204a87"/>
-      <w:shd w:val="clear" w:fill="f8f8f8"/>
+      <w:color w:val="204A87"/>
+      <w:sz w:val="22"/>
+      <w:shd w:val="clear" w:color="auto" w:fill="F8F8F8"/>
     </w:rPr>
   </w:style>
   <w:style w:type="character" w:customStyle="1" w:styleId="OperatorTok">
     <w:name w:val="OperatorTok"/>
     <w:basedOn w:val="VerbatimChar"/>
     <w:rPr>
+      <w:rFonts w:ascii="Consolas" w:hAnsi="Consolas"/>
       <w:b/>
-      <w:color w:val="ce5c00"/>
-      <w:shd w:val="clear" w:fill="f8f8f8"/>
+      <w:color w:val="CE5C00"/>
+      <w:sz w:val="22"/>
+      <w:shd w:val="clear" w:color="auto" w:fill="F8F8F8"/>
     </w:rPr>
   </w:style>
   <w:style w:type="character" w:customStyle="1" w:styleId="BuiltInTok">
     <w:name w:val="BuiltInTok"/>
     <w:basedOn w:val="VerbatimChar"/>
     <w:rPr>
-      <w:shd w:val="clear" w:fill="f8f8f8"/>
+      <w:rFonts w:ascii="Consolas" w:hAnsi="Consolas"/>
+      <w:sz w:val="22"/>
+      <w:shd w:val="clear" w:color="auto" w:fill="F8F8F8"/>
     </w:rPr>
   </w:style>
   <w:style w:type="character" w:customStyle="1" w:styleId="ExtensionTok">
     <w:name w:val="ExtensionTok"/>
     <w:basedOn w:val="VerbatimChar"/>
     <w:rPr>
-      <w:shd w:val="clear" w:fill="f8f8f8"/>
+      <w:rFonts w:ascii="Consolas" w:hAnsi="Consolas"/>
+      <w:sz w:val="22"/>
+      <w:shd w:val="clear" w:color="auto" w:fill="F8F8F8"/>
     </w:rPr>
   </w:style>
   <w:style w:type="character" w:customStyle="1" w:styleId="PreprocessorTok">
     <w:name w:val="PreprocessorTok"/>
     <w:basedOn w:val="VerbatimChar"/>
     <w:rPr>
+      <w:rFonts w:ascii="Consolas" w:hAnsi="Consolas"/>
       <w:i/>
-      <w:color w:val="8f5902"/>
-      <w:shd w:val="clear" w:fill="f8f8f8"/>
+      <w:color w:val="8F5902"/>
+      <w:sz w:val="22"/>
+      <w:shd w:val="clear" w:color="auto" w:fill="F8F8F8"/>
     </w:rPr>
   </w:style>
   <w:style w:type="character" w:customStyle="1" w:styleId="AttributeTok">
     <w:name w:val="AttributeTok"/>
     <w:basedOn w:val="VerbatimChar"/>
     <w:rPr>
-      <w:color w:val="204a87"/>
-      <w:shd w:val="clear" w:fill="f8f8f8"/>
+      <w:rFonts w:ascii="Consolas" w:hAnsi="Consolas"/>
+      <w:color w:val="204A87"/>
+      <w:sz w:val="22"/>
+      <w:shd w:val="clear" w:color="auto" w:fill="F8F8F8"/>
     </w:rPr>
   </w:style>
   <w:style w:type="character" w:customStyle="1" w:styleId="RegionMarkerTok">
     <w:name w:val="RegionMarkerTok"/>
     <w:basedOn w:val="VerbatimChar"/>
     <w:rPr>
-      <w:shd w:val="clear" w:fill="f8f8f8"/>
+      <w:rFonts w:ascii="Consolas" w:hAnsi="Consolas"/>
+      <w:sz w:val="22"/>
+      <w:shd w:val="clear" w:color="auto" w:fill="F8F8F8"/>
     </w:rPr>
   </w:style>
   <w:style w:type="character" w:customStyle="1" w:styleId="InformationTok">
     <w:name w:val="InformationTok"/>
     <w:basedOn w:val="VerbatimChar"/>
     <w:rPr>
+      <w:rFonts w:ascii="Consolas" w:hAnsi="Consolas"/>
       <w:b/>
       <w:i/>
-      <w:color w:val="8f5902"/>
-      <w:shd w:val="clear" w:fill="f8f8f8"/>
+      <w:color w:val="8F5902"/>
+      <w:sz w:val="22"/>
+      <w:shd w:val="clear" w:color="auto" w:fill="F8F8F8"/>
     </w:rPr>
   </w:style>
   <w:style w:type="character" w:customStyle="1" w:styleId="WarningTok">
     <w:name w:val="WarningTok"/>
     <w:basedOn w:val="VerbatimChar"/>
     <w:rPr>
+      <w:rFonts w:ascii="Consolas" w:hAnsi="Consolas"/>
       <w:b/>
       <w:i/>
-      <w:color w:val="8f5902"/>
-      <w:shd w:val="clear" w:fill="f8f8f8"/>
+      <w:color w:val="8F5902"/>
+      <w:sz w:val="22"/>
+      <w:shd w:val="clear" w:color="auto" w:fill="F8F8F8"/>
     </w:rPr>
   </w:style>
   <w:style w:type="character" w:customStyle="1" w:styleId="AlertTok">
     <w:name w:val="AlertTok"/>
     <w:basedOn w:val="VerbatimChar"/>
     <w:rPr>
-      <w:color w:val="ef2929"/>
-      <w:shd w:val="clear" w:fill="f8f8f8"/>
+      <w:rFonts w:ascii="Consolas" w:hAnsi="Consolas"/>
+      <w:color w:val="EF2929"/>
+      <w:sz w:val="22"/>
+      <w:shd w:val="clear" w:color="auto" w:fill="F8F8F8"/>
     </w:rPr>
   </w:style>
   <w:style w:type="character" w:customStyle="1" w:styleId="ErrorTok">
     <w:name w:val="ErrorTok"/>
     <w:basedOn w:val="VerbatimChar"/>
     <w:rPr>
+      <w:rFonts w:ascii="Consolas" w:hAnsi="Consolas"/>
       <w:b/>
-      <w:color w:val="a40000"/>
-      <w:shd w:val="clear" w:fill="f8f8f8"/>
+      <w:color w:val="A40000"/>
+      <w:sz w:val="22"/>
+      <w:shd w:val="clear" w:color="auto" w:fill="F8F8F8"/>
     </w:rPr>
   </w:style>
   <w:style w:type="character" w:customStyle="1" w:styleId="NormalTok">
     <w:name w:val="NormalTok"/>
     <w:basedOn w:val="VerbatimChar"/>
     <w:rPr>
-      <w:shd w:val="clear" w:fill="f8f8f8"/>
-    </w:rPr>
+      <w:rFonts w:ascii="Consolas" w:hAnsi="Consolas"/>
+      <w:sz w:val="22"/>
+      <w:shd w:val="clear" w:color="auto" w:fill="F8F8F8"/>
+    </w:rPr>
+  </w:style>
+  <w:style w:type="paragraph" w:styleId="Header">
+    <w:name w:val="header"/>
+    <w:basedOn w:val="Normal"/>
+    <w:link w:val="HeaderChar"/>
+    <w:rsid w:val="001A4F77"/>
+    <w:pPr>
+      <w:tabs>
+        <w:tab w:val="center" w:pos="4680"/>
+        <w:tab w:val="right" w:pos="9360"/>
+      </w:tabs>
+      <w:spacing w:after="0"/>
+    </w:pPr>
+  </w:style>
+  <w:style w:type="character" w:customStyle="1" w:styleId="HeaderChar">
+    <w:name w:val="Header Char"/>
+    <w:basedOn w:val="DefaultParagraphFont"/>
+    <w:link w:val="Header"/>
+    <w:rsid w:val="001A4F77"/>
+  </w:style>
+  <w:style w:type="paragraph" w:styleId="Footer">
+    <w:name w:val="footer"/>
+    <w:basedOn w:val="Normal"/>
+    <w:link w:val="FooterChar"/>
+    <w:uiPriority w:val="99"/>
+    <w:rsid w:val="001A4F77"/>
+    <w:pPr>
+      <w:tabs>
+        <w:tab w:val="center" w:pos="4680"/>
+        <w:tab w:val="right" w:pos="9360"/>
+      </w:tabs>
+      <w:spacing w:after="0"/>
+    </w:pPr>
+  </w:style>
+  <w:style w:type="character" w:customStyle="1" w:styleId="FooterChar">
+    <w:name w:val="Footer Char"/>
+    <w:basedOn w:val="DefaultParagraphFont"/>
+    <w:link w:val="Footer"/>
+    <w:uiPriority w:val="99"/>
+    <w:rsid w:val="001A4F77"/>
   </w:style>
 </w:styles>
 </file>

</xml_diff>